<commit_message>
docs: add memorando for Laboratório 02
</commit_message>
<xml_diff>
--- a/Laboratorio02/Emanuel dos Santos - Memorando.docx
+++ b/Laboratorio02/Emanuel dos Santos - Memorando.docx
@@ -119,26 +119,244 @@
       </w:r>
     </w:p>
     <w:p>
-      <w:pPr>
-        <w:rPr>
-          <w:lang w:val="pt-AO"/>
-        </w:rPr>
-      </w:pPr>
+      <w:r>
+        <w:t>O presente laboratório tem como principal objectivo a introdução ao modelo de programação paralela utilizando OpenMP, com foco na criação, gestão e sincronização de threads em ambientes de memória partilhada.</w:t>
+      </w:r>
+    </w:p>
+    <w:p/>
+    <w:p>
+      <w:r>
+        <w:t xml:space="preserve">O OpenMP é uma API para programação paralela em memória partilhada, compatível com C, C++ e Fortran, que assenta em três pilares: </w:t>
+      </w:r>
+      <w:r>
+        <w:rPr>
+          <w:b/>
+          <w:bCs/>
+        </w:rPr>
+        <w:t>directivas de compilação</w:t>
+      </w:r>
+      <w:r>
+        <w:t xml:space="preserve"> (</w:t>
+      </w:r>
+      <w:r>
+        <w:rPr>
+          <w:rFonts w:ascii="Courier New" w:hAnsi="Courier New" w:cs="Courier New"/>
+        </w:rPr>
+        <w:t>#pragma omp</w:t>
+      </w:r>
+      <w:r>
+        <w:t xml:space="preserve">), </w:t>
+      </w:r>
+      <w:r>
+        <w:rPr>
+          <w:b/>
+          <w:bCs/>
+        </w:rPr>
+        <w:t>funções de biblioteca</w:t>
+      </w:r>
+      <w:r>
+        <w:t xml:space="preserve"> (</w:t>
+      </w:r>
+      <w:r>
+        <w:rPr>
+          <w:rFonts w:ascii="Courier New" w:hAnsi="Courier New" w:cs="Courier New"/>
+        </w:rPr>
+        <w:t>&lt;omp.h&gt;</w:t>
+      </w:r>
+      <w:r>
+        <w:t xml:space="preserve">) e </w:t>
+      </w:r>
+      <w:r>
+        <w:rPr>
+          <w:b/>
+          <w:bCs/>
+        </w:rPr>
+        <w:t xml:space="preserve">variáveis de ambiente </w:t>
+      </w:r>
+      <w:r>
+        <w:t xml:space="preserve">como </w:t>
+      </w:r>
+      <w:r>
+        <w:rPr>
+          <w:rFonts w:ascii="Courier New" w:hAnsi="Courier New" w:cs="Courier New"/>
+        </w:rPr>
+        <w:t>OMP_NUM_THREADS</w:t>
+      </w:r>
+      <w:r>
+        <w:t xml:space="preserve">. O seu modelo de execução segue o paradigma </w:t>
+      </w:r>
+      <w:r>
+        <w:rPr>
+          <w:i/>
+          <w:iCs/>
+        </w:rPr>
+        <w:t>fork-join</w:t>
+      </w:r>
+      <w:r>
+        <w:t xml:space="preserve"> — o programa inicia com uma única thread </w:t>
+      </w:r>
+      <w:r>
+        <w:t>(</w:t>
+      </w:r>
+      <w:r>
+        <w:t>master</w:t>
+      </w:r>
+      <w:r>
+        <w:t xml:space="preserve">) </w:t>
+      </w:r>
+      <w:r>
+        <w:t xml:space="preserve">que, ao encontrar uma região paralela, cria um grupo de threads (fork); no final dessa região, todas sincronizam e a execução retorna à thread master (join). A integração num programa C existente requer apenas a flag de compilação </w:t>
+      </w:r>
+      <w:r>
+        <w:rPr>
+          <w:rFonts w:ascii="Courier New" w:hAnsi="Courier New" w:cs="Courier New"/>
+        </w:rPr>
+        <w:t>-fopenmp</w:t>
+      </w:r>
+      <w:r>
+        <w:t xml:space="preserve"> e a anotação das regiões paralelas com directivas como </w:t>
+      </w:r>
+      <w:r>
+        <w:rPr>
+          <w:rFonts w:ascii="Courier New" w:hAnsi="Courier New" w:cs="Courier New"/>
+        </w:rPr>
+        <w:t>#pragma omp parallel</w:t>
+      </w:r>
+      <w:r>
+        <w:t xml:space="preserve">, </w:t>
+      </w:r>
+      <w:r>
+        <w:rPr>
+          <w:rFonts w:ascii="Courier New" w:hAnsi="Courier New" w:cs="Courier New"/>
+        </w:rPr>
+        <w:t>#pragma omp for</w:t>
+      </w:r>
+      <w:r>
+        <w:t xml:space="preserve"> e </w:t>
+      </w:r>
+      <w:r>
+        <w:rPr>
+          <w:rFonts w:ascii="Courier New" w:hAnsi="Courier New" w:cs="Courier New"/>
+        </w:rPr>
+        <w:t>#pragma omp barrier</w:t>
+      </w:r>
+      <w:r>
+        <w:t>. Por ser restrito à memória partilhada, o OpenMP opera num</w:t>
+      </w:r>
+      <w:r>
+        <w:t>a</w:t>
+      </w:r>
+      <w:r>
+        <w:t xml:space="preserve"> únic</w:t>
+      </w:r>
+      <w:r>
+        <w:t>a</w:t>
+      </w:r>
+      <w:r>
+        <w:t xml:space="preserve"> </w:t>
+      </w:r>
+      <w:r>
+        <w:t>máquina</w:t>
+      </w:r>
+      <w:r>
+        <w:t>, sendo complementado por MPI em ambientes distribuídos</w:t>
+      </w:r>
+      <w:r>
+        <w:t>.</w:t>
+      </w:r>
+    </w:p>
+    <w:p/>
+    <w:p>
+      <w:pPr>
+        <w:rPr>
+          <w:lang w:val="pt-AO"/>
+        </w:rPr>
+      </w:pPr>
+      <w:r>
+        <w:rPr>
+          <w:lang w:val="pt-AO"/>
+        </w:rPr>
+        <w:t xml:space="preserve">São dois os problemas abordados: o </w:t>
+      </w:r>
+      <w:r>
+        <w:rPr>
+          <w:b/>
+          <w:bCs/>
+          <w:lang w:val="pt-AO"/>
+        </w:rPr>
+        <w:t>Problema 1</w:t>
+      </w:r>
+      <w:r>
+        <w:rPr>
+          <w:lang w:val="pt-AO"/>
+        </w:rPr>
+        <w:t xml:space="preserve"> explora a sincronização entre threads e o efeito de directivas como </w:t>
+      </w:r>
+      <w:r>
+        <w:rPr>
+          <w:rFonts w:ascii="Courier New" w:hAnsi="Courier New" w:cs="Courier New"/>
+          <w:lang w:val="pt-AO"/>
+        </w:rPr>
+        <w:t>nowait</w:t>
+      </w:r>
+      <w:r>
+        <w:rPr>
+          <w:lang w:val="pt-AO"/>
+        </w:rPr>
+        <w:t xml:space="preserve"> e </w:t>
+      </w:r>
+      <w:r>
+        <w:rPr>
+          <w:rFonts w:ascii="Courier New" w:hAnsi="Courier New" w:cs="Courier New"/>
+          <w:lang w:val="pt-AO"/>
+        </w:rPr>
+        <w:t>barrier</w:t>
+      </w:r>
+      <w:r>
+        <w:rPr>
+          <w:lang w:val="pt-AO"/>
+        </w:rPr>
+        <w:t xml:space="preserve">; o </w:t>
+      </w:r>
+      <w:r>
+        <w:rPr>
+          <w:b/>
+          <w:bCs/>
+          <w:lang w:val="pt-AO"/>
+        </w:rPr>
+        <w:t>Problema 2</w:t>
+      </w:r>
+      <w:r>
+        <w:rPr>
+          <w:lang w:val="pt-AO"/>
+        </w:rPr>
+        <w:t xml:space="preserve"> foca a paralelização de um loop interno com dependências de dados e as estratégias para garantir a correcção do resultado paralelo.</w:t>
+      </w:r>
+    </w:p>
+    <w:p>
+      <w:pPr>
+        <w:jc w:val="left"/>
+        <w:rPr>
+          <w:sz w:val="40"/>
+          <w:szCs w:val="40"/>
+        </w:rPr>
+      </w:pPr>
+      <w:r>
+        <w:br w:type="page"/>
+      </w:r>
     </w:p>
     <w:p>
       <w:pPr>
         <w:pStyle w:val="Heading1"/>
       </w:pPr>
-      <w:bookmarkStart w:id="2" w:name="_26nxd3y5y9o4" w:colFirst="0" w:colLast="0"/>
-      <w:bookmarkEnd w:id="2"/>
-      <w:r>
+      <w:r>
+        <w:lastRenderedPageBreak/>
         <w:t xml:space="preserve">Experiências </w:t>
       </w:r>
       <w:r>
         <w:t>Realizadas</w:t>
       </w:r>
     </w:p>
-    <w:p/>
     <w:p>
       <w:pPr>
         <w:pStyle w:val="Heading2"/>
@@ -166,10 +384,13 @@
     <w:p/>
     <w:p>
       <w:r>
+        <w:rPr>
+          <w:noProof/>
+        </w:rPr>
         <w:drawing>
-          <wp:inline distT="0" distB="0" distL="0" distR="0" wp14:anchorId="762AB8FA" wp14:editId="60075085">
-            <wp:extent cx="5068007" cy="3077004"/>
-            <wp:effectExtent l="0" t="0" r="0" b="9525"/>
+          <wp:inline distT="0" distB="0" distL="0" distR="0" wp14:anchorId="762AB8FA" wp14:editId="2FB34AD2">
+            <wp:extent cx="4037990" cy="2451637"/>
+            <wp:effectExtent l="0" t="0" r="635" b="6350"/>
             <wp:docPr id="1" name="Picture 1"/>
             <wp:cNvGraphicFramePr>
               <a:graphicFrameLocks xmlns:a="http://schemas.openxmlformats.org/drawingml/2006/main" noChangeAspect="1"/>
@@ -190,7 +411,7 @@
                   <pic:spPr>
                     <a:xfrm>
                       <a:off x="0" y="0"/>
-                      <a:ext cx="5068007" cy="3077004"/>
+                      <a:ext cx="4056492" cy="2462870"/>
                     </a:xfrm>
                     <a:prstGeom prst="rect">
                       <a:avLst/>
@@ -246,72 +467,184 @@
     <w:p>
       <w:pPr>
         <w:pStyle w:val="ListParagraph"/>
-        <w:numPr>
-          <w:ilvl w:val="0"/>
-          <w:numId w:val="14"/>
-        </w:numPr>
-      </w:pPr>
-      <w:r>
-        <w:t>Adicione a cláusula “</w:t>
+        <w:ind w:left="360"/>
+      </w:pPr>
+      <w:r>
+        <w:t>R:</w:t>
+      </w:r>
+    </w:p>
+    <w:p>
+      <w:pPr>
+        <w:pStyle w:val="ListParagraph"/>
+        <w:ind w:left="360"/>
+        <w:rPr>
+          <w:lang w:val="pt-AO"/>
+        </w:rPr>
+      </w:pPr>
+      <w:r>
+        <w:rPr>
+          <w:lang w:val="pt-AO"/>
+        </w:rPr>
+        <w:t>O código foi compilado com o seguinte comando</w:t>
+      </w:r>
+      <w:r>
+        <w:rPr>
+          <w:lang w:val="pt-AO"/>
+        </w:rPr>
+        <w:t>:</w:t>
+      </w:r>
+    </w:p>
+    <w:p>
+      <w:pPr>
+        <w:pStyle w:val="ListParagraph"/>
+        <w:ind w:left="360"/>
+        <w:rPr>
+          <w:lang w:val="pt-AO"/>
+        </w:rPr>
+      </w:pPr>
+    </w:p>
+    <w:p>
+      <w:pPr>
+        <w:pBdr>
+          <w:left w:val="single" w:sz="4" w:space="10" w:color="4F81BD" w:themeColor="accent1"/>
+        </w:pBdr>
+        <w:spacing w:line="240" w:lineRule="auto"/>
+        <w:ind w:left="720"/>
+        <w:rPr>
+          <w:rFonts w:ascii="Courier New" w:eastAsia="Times New Roman" w:hAnsi="Courier New" w:cs="Courier New"/>
+          <w:sz w:val="16"/>
+          <w:szCs w:val="16"/>
+          <w:lang w:val="pt-AO"/>
+        </w:rPr>
+      </w:pPr>
+      <w:r>
+        <w:rPr>
+          <w:rFonts w:ascii="Courier New" w:eastAsia="Times New Roman" w:hAnsi="Courier New" w:cs="Courier New"/>
+          <w:sz w:val="16"/>
+          <w:szCs w:val="16"/>
+          <w:lang w:val="pt-AO"/>
+        </w:rPr>
+        <w:t>gcc -fopenmp omp1.c -o omp1</w:t>
+      </w:r>
+    </w:p>
+    <w:p>
+      <w:pPr>
+        <w:pStyle w:val="ListParagraph"/>
+        <w:ind w:left="360"/>
+      </w:pPr>
+    </w:p>
+    <w:p>
+      <w:pPr>
+        <w:pStyle w:val="ListParagraph"/>
+        <w:ind w:left="360"/>
+      </w:pPr>
+      <w:r>
+        <w:t xml:space="preserve">O programa foi </w:t>
+      </w:r>
+      <w:r>
+        <w:t>testado</w:t>
+      </w:r>
+      <w:r>
+        <w:t xml:space="preserve"> com diferentes valores de </w:t>
       </w:r>
       <w:r>
         <w:rPr>
           <w:rFonts w:ascii="Courier New" w:hAnsi="Courier New" w:cs="Courier New"/>
         </w:rPr>
-        <w:t>nowait</w:t>
-      </w:r>
-      <w:r>
-        <w:t>” à directiva for na linha 9. A saída foi alterada? Porquê?</w:t>
-      </w:r>
-    </w:p>
-    <w:p>
-      <w:pPr>
-        <w:pStyle w:val="ListParagraph"/>
-        <w:numPr>
-          <w:ilvl w:val="0"/>
-          <w:numId w:val="14"/>
-        </w:numPr>
-      </w:pPr>
-      <w:r>
-        <w:lastRenderedPageBreak/>
-        <w:t xml:space="preserve">Adicione uma barreira </w:t>
+        <w:t>OMP_NUM_THREADS</w:t>
       </w:r>
       <w:r>
         <w:rPr>
           <w:rFonts w:ascii="Courier New" w:hAnsi="Courier New" w:cs="Courier New"/>
         </w:rPr>
-        <w:t>(#pragma omp barrier</w:t>
-      </w:r>
-      <w:r>
-        <w:t>) entre as linhas 13 e 14. Compare a saída com a) e b).</w:t>
-      </w:r>
-    </w:p>
-    <w:p>
-      <w:pPr>
-        <w:pStyle w:val="Heading2"/>
-        <w:numPr>
-          <w:ilvl w:val="0"/>
-          <w:numId w:val="0"/>
-        </w:numPr>
-        <w:ind w:left="576" w:hanging="576"/>
-      </w:pPr>
-      <w:r>
-        <w:t>Problema 2</w:t>
-      </w:r>
-    </w:p>
-    <w:p>
-      <w:r>
-        <w:t>No segundo problema, o estudante é solicitado a paralelizar um loop interno com dependências de dados. O código básico que deve ser executado em paralelo é o seguinte:</w:t>
-      </w:r>
-    </w:p>
-    <w:p/>
-    <w:p>
+        <w:t xml:space="preserve"> </w:t>
+      </w:r>
+      <w:r>
+        <w:t>(2, 4 e 8):</w:t>
+      </w:r>
+    </w:p>
+    <w:p>
+      <w:pPr>
+        <w:pStyle w:val="ListParagraph"/>
+        <w:ind w:left="360"/>
+      </w:pPr>
+    </w:p>
+    <w:p>
+      <w:pPr>
+        <w:pBdr>
+          <w:left w:val="single" w:sz="4" w:space="10" w:color="4F81BD" w:themeColor="accent1"/>
+        </w:pBdr>
+        <w:spacing w:line="240" w:lineRule="auto"/>
+        <w:ind w:left="720"/>
+        <w:rPr>
+          <w:rFonts w:ascii="Courier New" w:eastAsia="Times New Roman" w:hAnsi="Courier New" w:cs="Courier New"/>
+          <w:sz w:val="16"/>
+          <w:szCs w:val="16"/>
+          <w:lang w:val="pt-AO"/>
+        </w:rPr>
+      </w:pPr>
+      <w:r>
+        <w:rPr>
+          <w:rFonts w:ascii="Courier New" w:eastAsia="Times New Roman" w:hAnsi="Courier New" w:cs="Courier New"/>
+          <w:sz w:val="16"/>
+          <w:szCs w:val="16"/>
+          <w:lang w:val="pt-AO"/>
+        </w:rPr>
+        <w:t>export OMP_NUM_THREADS=</w:t>
+      </w:r>
+      <w:r>
+        <w:rPr>
+          <w:rFonts w:ascii="Courier New" w:eastAsia="Times New Roman" w:hAnsi="Courier New" w:cs="Courier New"/>
+          <w:sz w:val="16"/>
+          <w:szCs w:val="16"/>
+          <w:lang w:val="pt-AO"/>
+        </w:rPr>
+        <w:t>2</w:t>
+      </w:r>
+    </w:p>
+    <w:p>
+      <w:pPr>
+        <w:pBdr>
+          <w:left w:val="single" w:sz="4" w:space="10" w:color="4F81BD" w:themeColor="accent1"/>
+        </w:pBdr>
+        <w:spacing w:line="240" w:lineRule="auto"/>
+        <w:ind w:left="720"/>
+        <w:rPr>
+          <w:rFonts w:ascii="Courier New" w:eastAsia="Times New Roman" w:hAnsi="Courier New" w:cs="Courier New"/>
+          <w:sz w:val="16"/>
+          <w:szCs w:val="16"/>
+          <w:lang w:val="pt-AO"/>
+        </w:rPr>
+      </w:pPr>
+      <w:r>
+        <w:rPr>
+          <w:rFonts w:ascii="Courier New" w:eastAsia="Times New Roman" w:hAnsi="Courier New" w:cs="Courier New"/>
+          <w:sz w:val="16"/>
+          <w:szCs w:val="16"/>
+          <w:lang w:val="pt-AO"/>
+        </w:rPr>
+        <w:t>./omp1</w:t>
+      </w:r>
+    </w:p>
+    <w:p>
+      <w:pPr>
+        <w:rPr>
+          <w:lang w:val="en-US"/>
+        </w:rPr>
+      </w:pPr>
+    </w:p>
+    <w:p>
+      <w:pPr>
+        <w:pStyle w:val="ListParagraph"/>
+        <w:keepNext/>
+        <w:ind w:left="360"/>
+      </w:pPr>
       <w:r>
         <w:drawing>
-          <wp:inline distT="0" distB="0" distL="0" distR="0" wp14:anchorId="27A3ECBE" wp14:editId="56BE0293">
-            <wp:extent cx="3391373" cy="1228896"/>
-            <wp:effectExtent l="0" t="0" r="0" b="9525"/>
-            <wp:docPr id="19" name="Picture 19"/>
+          <wp:inline distT="0" distB="0" distL="0" distR="0" wp14:anchorId="5858907E" wp14:editId="7954B8A6">
+            <wp:extent cx="5733415" cy="3444875"/>
+            <wp:effectExtent l="0" t="0" r="635" b="3175"/>
+            <wp:docPr id="2" name="Picture 2"/>
             <wp:cNvGraphicFramePr>
               <a:graphicFrameLocks xmlns:a="http://schemas.openxmlformats.org/drawingml/2006/main" noChangeAspect="1"/>
             </wp:cNvGraphicFramePr>
@@ -331,7 +664,7 @@
                   <pic:spPr>
                     <a:xfrm>
                       <a:off x="0" y="0"/>
-                      <a:ext cx="3391373" cy="1228896"/>
+                      <a:ext cx="5733415" cy="3444875"/>
                     </a:xfrm>
                     <a:prstGeom prst="rect">
                       <a:avLst/>
@@ -344,28 +677,118 @@
         </w:drawing>
       </w:r>
     </w:p>
+    <w:p>
+      <w:pPr>
+        <w:pStyle w:val="Caption"/>
+        <w:rPr>
+          <w:noProof/>
+        </w:rPr>
+      </w:pPr>
+      <w:r>
+        <w:t xml:space="preserve">Figura </w:t>
+      </w:r>
+      <w:r>
+        <w:fldChar w:fldCharType="begin"/>
+      </w:r>
+      <w:r>
+        <w:instrText xml:space="preserve"> SEQ Figura \* ARABIC </w:instrText>
+      </w:r>
+      <w:r>
+        <w:fldChar w:fldCharType="separate"/>
+      </w:r>
+      <w:r>
+        <w:rPr>
+          <w:noProof/>
+        </w:rPr>
+        <w:t>1</w:t>
+      </w:r>
+      <w:r>
+        <w:fldChar w:fldCharType="end"/>
+      </w:r>
+      <w:r>
+        <w:t xml:space="preserve"> - </w:t>
+      </w:r>
+      <w:r>
+        <w:rPr>
+          <w:noProof/>
+        </w:rPr>
+        <w:t>E</w:t>
+      </w:r>
+      <w:r>
+        <w:rPr>
+          <w:noProof/>
+        </w:rPr>
+        <w:t>xecução do omp1.c com OMP_NUM_THREADS=</w:t>
+      </w:r>
+      <w:r>
+        <w:rPr>
+          <w:noProof/>
+        </w:rPr>
+        <w:t>2</w:t>
+      </w:r>
+    </w:p>
+    <w:p>
+      <w:r>
+        <w:t>Com 2 threads, o OpenMP dividiu as 30 iterações entre a Thread 0 (iterações 0–14) e a Thread 1 (iterações 15–29). A ordem de impressão reflecte o escalonamento do sistema: a Thread 1 começou a imprimir antes de a Thread 0 terminar o seu bloco, o que evidencia a execução verdadeiramente paralela e não-determinística. A barreira implícita no final do #pragma omp for garantiu, no entanto, que ambas as mensagens "almost.." e "done!" surgissem apenas após todas as iterações terem sido concluídas.</w:t>
+      </w:r>
+    </w:p>
     <w:p/>
     <w:p>
-      <w:r>
-        <w:t>onde definimos uma função simples para manipular os dados.</w:t>
-      </w:r>
-    </w:p>
-    <w:p/>
-    <w:p>
-      <w:pPr>
-        <w:rPr>
-          <w:lang w:val="en-US"/>
-        </w:rPr>
-      </w:pPr>
-      <w:r>
-        <w:rPr>
-          <w:lang w:val="en-US"/>
-        </w:rPr>
+      <w:pPr>
+        <w:jc w:val="left"/>
+      </w:pPr>
+      <w:r>
+        <w:br w:type="page"/>
+      </w:r>
+    </w:p>
+    <w:p>
+      <w:pPr>
+        <w:pStyle w:val="ListParagraph"/>
+        <w:numPr>
+          <w:ilvl w:val="0"/>
+          <w:numId w:val="14"/>
+        </w:numPr>
+      </w:pPr>
+      <w:r>
+        <w:t>Adicione a cláusula “</w:t>
+      </w:r>
+      <w:r>
+        <w:rPr>
+          <w:rFonts w:ascii="Courier New" w:hAnsi="Courier New" w:cs="Courier New"/>
+        </w:rPr>
+        <w:t>nowait</w:t>
+      </w:r>
+      <w:r>
+        <w:t>” à directiva for na linha 9. A saída foi alterada? Porquê?</w:t>
+      </w:r>
+    </w:p>
+    <w:p>
+      <w:pPr>
+        <w:pStyle w:val="ListParagraph"/>
+        <w:ind w:left="360"/>
+      </w:pPr>
+      <w:r>
+        <w:t>R:</w:t>
+      </w:r>
+    </w:p>
+    <w:p>
+      <w:pPr>
+        <w:pStyle w:val="ListParagraph"/>
+        <w:ind w:left="360"/>
+      </w:pPr>
+    </w:p>
+    <w:p>
+      <w:pPr>
+        <w:pStyle w:val="ListParagraph"/>
+        <w:keepNext/>
+        <w:ind w:left="360"/>
+      </w:pPr>
+      <w:r>
         <w:drawing>
-          <wp:inline distT="0" distB="0" distL="0" distR="0" wp14:anchorId="16E5133C" wp14:editId="6D1F9D5E">
-            <wp:extent cx="2429214" cy="228632"/>
-            <wp:effectExtent l="0" t="0" r="0" b="0"/>
-            <wp:docPr id="25" name="Picture 25"/>
+          <wp:inline distT="0" distB="0" distL="0" distR="0" wp14:anchorId="25F8DCAD" wp14:editId="3BB5611C">
+            <wp:extent cx="5733415" cy="3444875"/>
+            <wp:effectExtent l="0" t="0" r="635" b="3175"/>
+            <wp:docPr id="5" name="Picture 5"/>
             <wp:cNvGraphicFramePr>
               <a:graphicFrameLocks xmlns:a="http://schemas.openxmlformats.org/drawingml/2006/main" noChangeAspect="1"/>
             </wp:cNvGraphicFramePr>
@@ -385,7 +808,7 @@
                   <pic:spPr>
                     <a:xfrm>
                       <a:off x="0" y="0"/>
-                      <a:ext cx="2429214" cy="228632"/>
+                      <a:ext cx="5733415" cy="3444875"/>
                     </a:xfrm>
                     <a:prstGeom prst="rect">
                       <a:avLst/>
@@ -398,6 +821,361 @@
         </w:drawing>
       </w:r>
     </w:p>
+    <w:p>
+      <w:pPr>
+        <w:pStyle w:val="Caption"/>
+      </w:pPr>
+      <w:r>
+        <w:t xml:space="preserve">Figura </w:t>
+      </w:r>
+      <w:r>
+        <w:fldChar w:fldCharType="begin"/>
+      </w:r>
+      <w:r>
+        <w:instrText xml:space="preserve"> SEQ Figura \* ARABIC </w:instrText>
+      </w:r>
+      <w:r>
+        <w:fldChar w:fldCharType="separate"/>
+      </w:r>
+      <w:r>
+        <w:rPr>
+          <w:noProof/>
+        </w:rPr>
+        <w:t>2</w:t>
+      </w:r>
+      <w:r>
+        <w:fldChar w:fldCharType="end"/>
+      </w:r>
+      <w:r>
+        <w:t xml:space="preserve"> - Código com nowait e resultado da execução</w:t>
+      </w:r>
+      <w:r>
+        <w:t xml:space="preserve"> </w:t>
+      </w:r>
+      <w:r>
+        <w:t>com OMP_NUM_THREADS=2</w:t>
+      </w:r>
+    </w:p>
+    <w:p>
+      <w:pPr>
+        <w:pStyle w:val="ListParagraph"/>
+        <w:ind w:left="360"/>
+      </w:pPr>
+      <w:r>
+        <w:t>Com a cláusula nowait, a Thread 1 concluiu as suas iterações (15–29) e imprimiu imediatamente "almost.." e "done!" enquanto a Thread 0 ainda estava a executar as suas iterações (5–14). Isto demonstra com clareza o efeito do nowait: ao remover a barreira implícita do #pragma omp for, cada thread avança para as instruções seguintes assim que termina as suas próprias iterações, sem aguardar pelas restantes. Sem nowait, este comportamento seria impossível — a Thread 1 seria forçada a esperar pela Thread 0 antes de qualquer uma imprimir "almost..".</w:t>
+      </w:r>
+    </w:p>
+    <w:p>
+      <w:pPr>
+        <w:pStyle w:val="ListParagraph"/>
+        <w:ind w:left="360"/>
+      </w:pPr>
+    </w:p>
+    <w:p>
+      <w:pPr>
+        <w:jc w:val="left"/>
+      </w:pPr>
+      <w:r>
+        <w:br w:type="page"/>
+      </w:r>
+    </w:p>
+    <w:p>
+      <w:pPr>
+        <w:pStyle w:val="ListParagraph"/>
+        <w:numPr>
+          <w:ilvl w:val="0"/>
+          <w:numId w:val="14"/>
+        </w:numPr>
+      </w:pPr>
+      <w:r>
+        <w:t xml:space="preserve">Adicione uma barreira </w:t>
+      </w:r>
+      <w:r>
+        <w:rPr>
+          <w:rFonts w:ascii="Courier New" w:hAnsi="Courier New" w:cs="Courier New"/>
+        </w:rPr>
+        <w:t>(#pragma omp barrier</w:t>
+      </w:r>
+      <w:r>
+        <w:t>) entre as linhas 13 e 14. Compare a</w:t>
+      </w:r>
+      <w:r>
+        <w:t xml:space="preserve"> </w:t>
+      </w:r>
+      <w:r>
+        <w:t>saída com a) e b).</w:t>
+      </w:r>
+    </w:p>
+    <w:p>
+      <w:pPr>
+        <w:pStyle w:val="ListParagraph"/>
+        <w:ind w:left="360"/>
+      </w:pPr>
+      <w:r>
+        <w:t>R:</w:t>
+      </w:r>
+    </w:p>
+    <w:p>
+      <w:pPr>
+        <w:pStyle w:val="ListParagraph"/>
+        <w:ind w:left="360"/>
+      </w:pPr>
+    </w:p>
+    <w:p>
+      <w:pPr>
+        <w:pStyle w:val="ListParagraph"/>
+        <w:keepNext/>
+        <w:ind w:left="360"/>
+      </w:pPr>
+      <w:r>
+        <w:drawing>
+          <wp:inline distT="0" distB="0" distL="0" distR="0" wp14:anchorId="0DF7D2B9" wp14:editId="4CAE09AF">
+            <wp:extent cx="5733415" cy="3522345"/>
+            <wp:effectExtent l="0" t="0" r="635" b="1905"/>
+            <wp:docPr id="6" name="Picture 6"/>
+            <wp:cNvGraphicFramePr>
+              <a:graphicFrameLocks xmlns:a="http://schemas.openxmlformats.org/drawingml/2006/main" noChangeAspect="1"/>
+            </wp:cNvGraphicFramePr>
+            <a:graphic xmlns:a="http://schemas.openxmlformats.org/drawingml/2006/main">
+              <a:graphicData uri="http://schemas.openxmlformats.org/drawingml/2006/picture">
+                <pic:pic xmlns:pic="http://schemas.openxmlformats.org/drawingml/2006/picture">
+                  <pic:nvPicPr>
+                    <pic:cNvPr id="1" name=""/>
+                    <pic:cNvPicPr/>
+                  </pic:nvPicPr>
+                  <pic:blipFill>
+                    <a:blip r:embed="rId11"/>
+                    <a:stretch>
+                      <a:fillRect/>
+                    </a:stretch>
+                  </pic:blipFill>
+                  <pic:spPr>
+                    <a:xfrm>
+                      <a:off x="0" y="0"/>
+                      <a:ext cx="5733415" cy="3522345"/>
+                    </a:xfrm>
+                    <a:prstGeom prst="rect">
+                      <a:avLst/>
+                    </a:prstGeom>
+                  </pic:spPr>
+                </pic:pic>
+              </a:graphicData>
+            </a:graphic>
+          </wp:inline>
+        </w:drawing>
+      </w:r>
+    </w:p>
+    <w:p>
+      <w:pPr>
+        <w:pStyle w:val="Caption"/>
+        <w:rPr>
+          <w:noProof/>
+        </w:rPr>
+      </w:pPr>
+      <w:r>
+        <w:t xml:space="preserve">Figura </w:t>
+      </w:r>
+      <w:r>
+        <w:fldChar w:fldCharType="begin"/>
+      </w:r>
+      <w:r>
+        <w:instrText xml:space="preserve"> SEQ Figura \* ARABIC </w:instrText>
+      </w:r>
+      <w:r>
+        <w:fldChar w:fldCharType="separate"/>
+      </w:r>
+      <w:r>
+        <w:rPr>
+          <w:noProof/>
+        </w:rPr>
+        <w:t>3</w:t>
+      </w:r>
+      <w:r>
+        <w:fldChar w:fldCharType="end"/>
+      </w:r>
+      <w:r>
+        <w:t xml:space="preserve"> - </w:t>
+      </w:r>
+      <w:r>
+        <w:t>Código com #pragma omp barrier e resultado da execução</w:t>
+      </w:r>
+      <w:r>
+        <w:t xml:space="preserve"> </w:t>
+      </w:r>
+      <w:r>
+        <w:rPr>
+          <w:noProof/>
+        </w:rPr>
+        <w:t>com OMP_NUM_</w:t>
+      </w:r>
+      <w:r>
+        <w:t>THREADS</w:t>
+      </w:r>
+      <w:r>
+        <w:rPr>
+          <w:noProof/>
+        </w:rPr>
+        <w:t>=</w:t>
+      </w:r>
+      <w:r>
+        <w:rPr>
+          <w:noProof/>
+        </w:rPr>
+        <w:t>2</w:t>
+      </w:r>
+    </w:p>
+    <w:p>
+      <w:pPr>
+        <w:pStyle w:val="ListParagraph"/>
+        <w:ind w:left="360"/>
+      </w:pPr>
+    </w:p>
+    <w:p>
+      <w:pPr>
+        <w:pStyle w:val="ListParagraph"/>
+        <w:ind w:left="360"/>
+      </w:pPr>
+    </w:p>
+    <w:p>
+      <w:pPr>
+        <w:pStyle w:val="ListParagraph"/>
+        <w:ind w:left="360"/>
+      </w:pPr>
+    </w:p>
+    <w:p>
+      <w:pPr>
+        <w:pStyle w:val="ListParagraph"/>
+        <w:ind w:left="360"/>
+      </w:pPr>
+    </w:p>
+    <w:p>
+      <w:pPr>
+        <w:jc w:val="left"/>
+        <w:rPr>
+          <w:sz w:val="32"/>
+          <w:szCs w:val="32"/>
+        </w:rPr>
+      </w:pPr>
+      <w:r>
+        <w:br w:type="page"/>
+      </w:r>
+    </w:p>
+    <w:p>
+      <w:pPr>
+        <w:pStyle w:val="Heading2"/>
+        <w:numPr>
+          <w:ilvl w:val="0"/>
+          <w:numId w:val="0"/>
+        </w:numPr>
+        <w:ind w:left="576" w:hanging="576"/>
+      </w:pPr>
+      <w:r>
+        <w:t>Problema 2</w:t>
+      </w:r>
+    </w:p>
+    <w:p>
+      <w:r>
+        <w:t>No segundo problema, o estudante é solicitado a paralelizar um loop interno com dependências de dados. O código básico que deve ser executado em paralelo é o seguinte:</w:t>
+      </w:r>
+    </w:p>
+    <w:p/>
+    <w:p>
+      <w:r>
+        <w:rPr>
+          <w:noProof/>
+        </w:rPr>
+        <w:drawing>
+          <wp:inline distT="0" distB="0" distL="0" distR="0" wp14:anchorId="27A3ECBE" wp14:editId="5240450A">
+            <wp:extent cx="2196548" cy="795940"/>
+            <wp:effectExtent l="0" t="0" r="0" b="4445"/>
+            <wp:docPr id="19" name="Picture 19"/>
+            <wp:cNvGraphicFramePr>
+              <a:graphicFrameLocks xmlns:a="http://schemas.openxmlformats.org/drawingml/2006/main" noChangeAspect="1"/>
+            </wp:cNvGraphicFramePr>
+            <a:graphic xmlns:a="http://schemas.openxmlformats.org/drawingml/2006/main">
+              <a:graphicData uri="http://schemas.openxmlformats.org/drawingml/2006/picture">
+                <pic:pic xmlns:pic="http://schemas.openxmlformats.org/drawingml/2006/picture">
+                  <pic:nvPicPr>
+                    <pic:cNvPr id="1" name=""/>
+                    <pic:cNvPicPr/>
+                  </pic:nvPicPr>
+                  <pic:blipFill>
+                    <a:blip r:embed="rId12"/>
+                    <a:stretch>
+                      <a:fillRect/>
+                    </a:stretch>
+                  </pic:blipFill>
+                  <pic:spPr>
+                    <a:xfrm>
+                      <a:off x="0" y="0"/>
+                      <a:ext cx="2219158" cy="804133"/>
+                    </a:xfrm>
+                    <a:prstGeom prst="rect">
+                      <a:avLst/>
+                    </a:prstGeom>
+                  </pic:spPr>
+                </pic:pic>
+              </a:graphicData>
+            </a:graphic>
+          </wp:inline>
+        </w:drawing>
+      </w:r>
+    </w:p>
+    <w:p/>
+    <w:p>
+      <w:r>
+        <w:t>onde definimos uma função simples para manipular os dados.</w:t>
+      </w:r>
+    </w:p>
+    <w:p/>
+    <w:p>
+      <w:pPr>
+        <w:rPr>
+          <w:lang w:val="en-US"/>
+        </w:rPr>
+      </w:pPr>
+      <w:r>
+        <w:rPr>
+          <w:noProof/>
+          <w:lang w:val="en-US"/>
+        </w:rPr>
+        <w:drawing>
+          <wp:inline distT="0" distB="0" distL="0" distR="0" wp14:anchorId="16E5133C" wp14:editId="17DB1277">
+            <wp:extent cx="1709530" cy="160897"/>
+            <wp:effectExtent l="0" t="0" r="5080" b="0"/>
+            <wp:docPr id="25" name="Picture 25"/>
+            <wp:cNvGraphicFramePr>
+              <a:graphicFrameLocks xmlns:a="http://schemas.openxmlformats.org/drawingml/2006/main" noChangeAspect="1"/>
+            </wp:cNvGraphicFramePr>
+            <a:graphic xmlns:a="http://schemas.openxmlformats.org/drawingml/2006/main">
+              <a:graphicData uri="http://schemas.openxmlformats.org/drawingml/2006/picture">
+                <pic:pic xmlns:pic="http://schemas.openxmlformats.org/drawingml/2006/picture">
+                  <pic:nvPicPr>
+                    <pic:cNvPr id="1" name=""/>
+                    <pic:cNvPicPr/>
+                  </pic:nvPicPr>
+                  <pic:blipFill>
+                    <a:blip r:embed="rId13"/>
+                    <a:stretch>
+                      <a:fillRect/>
+                    </a:stretch>
+                  </pic:blipFill>
+                  <pic:spPr>
+                    <a:xfrm>
+                      <a:off x="0" y="0"/>
+                      <a:ext cx="1785496" cy="168047"/>
+                    </a:xfrm>
+                    <a:prstGeom prst="rect">
+                      <a:avLst/>
+                    </a:prstGeom>
+                  </pic:spPr>
+                </pic:pic>
+              </a:graphicData>
+            </a:graphic>
+          </wp:inline>
+        </w:drawing>
+      </w:r>
+    </w:p>
     <w:p/>
     <w:p>
       <w:pPr>
@@ -408,8 +1186,306 @@
         </w:numPr>
       </w:pPr>
       <w:r>
-        <w:t xml:space="preserve">Compile e execute a versão serial do código (omp2.c). </w:t>
-      </w:r>
+        <w:t>Compile e execute a versão serial do código (omp2.c).</w:t>
+      </w:r>
+    </w:p>
+    <w:p>
+      <w:pPr>
+        <w:pStyle w:val="ListParagraph"/>
+        <w:ind w:left="360"/>
+      </w:pPr>
+      <w:r>
+        <w:t>R:</w:t>
+      </w:r>
+    </w:p>
+    <w:p>
+      <w:pPr>
+        <w:pStyle w:val="ListParagraph"/>
+        <w:ind w:left="360"/>
+        <w:rPr>
+          <w:lang w:val="pt-AO"/>
+        </w:rPr>
+      </w:pPr>
+      <w:r>
+        <w:t>O código foi compilado e executado sem paralelismo:</w:t>
+      </w:r>
+    </w:p>
+    <w:p>
+      <w:pPr>
+        <w:pStyle w:val="ListParagraph"/>
+        <w:ind w:left="360"/>
+        <w:rPr>
+          <w:lang w:val="pt-AO"/>
+        </w:rPr>
+      </w:pPr>
+    </w:p>
+    <w:p>
+      <w:pPr>
+        <w:pBdr>
+          <w:left w:val="single" w:sz="4" w:space="10" w:color="4F81BD" w:themeColor="accent1"/>
+        </w:pBdr>
+        <w:spacing w:line="240" w:lineRule="auto"/>
+        <w:ind w:left="720"/>
+        <w:rPr>
+          <w:rFonts w:ascii="Courier New" w:eastAsia="Times New Roman" w:hAnsi="Courier New" w:cs="Courier New"/>
+          <w:sz w:val="16"/>
+          <w:szCs w:val="16"/>
+          <w:lang w:val="pt-BR"/>
+        </w:rPr>
+      </w:pPr>
+      <w:r>
+        <w:rPr>
+          <w:rFonts w:ascii="Courier New" w:eastAsia="Times New Roman" w:hAnsi="Courier New" w:cs="Courier New"/>
+          <w:sz w:val="16"/>
+          <w:szCs w:val="16"/>
+          <w:lang w:val="pt-AO"/>
+        </w:rPr>
+        <w:t>cc</w:t>
+      </w:r>
+      <w:r>
+        <w:rPr>
+          <w:rFonts w:ascii="Courier New" w:eastAsia="Times New Roman" w:hAnsi="Courier New" w:cs="Courier New"/>
+          <w:sz w:val="16"/>
+          <w:szCs w:val="16"/>
+          <w:lang w:val="pt-AO"/>
+        </w:rPr>
+        <w:t xml:space="preserve"> </w:t>
+      </w:r>
+      <w:r>
+        <w:rPr>
+          <w:rFonts w:ascii="Courier New" w:eastAsia="Times New Roman" w:hAnsi="Courier New" w:cs="Courier New"/>
+          <w:sz w:val="16"/>
+          <w:szCs w:val="16"/>
+          <w:lang w:val="pt-AO"/>
+        </w:rPr>
+        <w:t>omp</w:t>
+      </w:r>
+      <w:r>
+        <w:rPr>
+          <w:rFonts w:ascii="Courier New" w:eastAsia="Times New Roman" w:hAnsi="Courier New" w:cs="Courier New"/>
+          <w:sz w:val="16"/>
+          <w:szCs w:val="16"/>
+          <w:lang w:val="pt-AO"/>
+        </w:rPr>
+        <w:t>2</w:t>
+      </w:r>
+      <w:r>
+        <w:rPr>
+          <w:rFonts w:ascii="Courier New" w:eastAsia="Times New Roman" w:hAnsi="Courier New" w:cs="Courier New"/>
+          <w:sz w:val="16"/>
+          <w:szCs w:val="16"/>
+          <w:lang w:val="pt-AO"/>
+        </w:rPr>
+        <w:t>.c -o omp</w:t>
+      </w:r>
+      <w:r>
+        <w:rPr>
+          <w:rFonts w:ascii="Courier New" w:eastAsia="Times New Roman" w:hAnsi="Courier New" w:cs="Courier New"/>
+          <w:sz w:val="16"/>
+          <w:szCs w:val="16"/>
+          <w:lang w:val="pt-AO"/>
+        </w:rPr>
+        <w:t xml:space="preserve">2 </w:t>
+      </w:r>
+      <w:r>
+        <w:rPr>
+          <w:rFonts w:ascii="Courier New" w:eastAsia="Times New Roman" w:hAnsi="Courier New" w:cs="Courier New"/>
+          <w:sz w:val="16"/>
+          <w:szCs w:val="16"/>
+          <w:lang w:val="pt-BR"/>
+        </w:rPr>
+        <w:t>&amp;</w:t>
+      </w:r>
+      <w:r>
+        <w:rPr>
+          <w:rFonts w:ascii="Courier New" w:eastAsia="Times New Roman" w:hAnsi="Courier New" w:cs="Courier New"/>
+          <w:sz w:val="16"/>
+          <w:szCs w:val="16"/>
+          <w:lang w:val="pt-BR"/>
+        </w:rPr>
+        <w:t>&amp; ./omp2</w:t>
+      </w:r>
+    </w:p>
+    <w:p>
+      <w:pPr>
+        <w:pStyle w:val="ListParagraph"/>
+        <w:tabs>
+          <w:tab w:val="left" w:pos="5750"/>
+        </w:tabs>
+        <w:ind w:left="360"/>
+        <w:rPr>
+          <w:lang w:val="pt-AO"/>
+        </w:rPr>
+      </w:pPr>
+      <w:r>
+        <w:rPr>
+          <w:lang w:val="pt-AO"/>
+        </w:rPr>
+        <w:tab/>
+      </w:r>
+    </w:p>
+    <w:p>
+      <w:pPr>
+        <w:pStyle w:val="ListParagraph"/>
+        <w:keepNext/>
+        <w:ind w:left="360"/>
+      </w:pPr>
+      <w:r>
+        <w:drawing>
+          <wp:inline distT="0" distB="0" distL="0" distR="0" wp14:anchorId="6CDD41F3" wp14:editId="72D22FDB">
+            <wp:extent cx="5733415" cy="3522345"/>
+            <wp:effectExtent l="0" t="0" r="635" b="1905"/>
+            <wp:docPr id="12" name="Picture 12"/>
+            <wp:cNvGraphicFramePr>
+              <a:graphicFrameLocks xmlns:a="http://schemas.openxmlformats.org/drawingml/2006/main" noChangeAspect="1"/>
+            </wp:cNvGraphicFramePr>
+            <a:graphic xmlns:a="http://schemas.openxmlformats.org/drawingml/2006/main">
+              <a:graphicData uri="http://schemas.openxmlformats.org/drawingml/2006/picture">
+                <pic:pic xmlns:pic="http://schemas.openxmlformats.org/drawingml/2006/picture">
+                  <pic:nvPicPr>
+                    <pic:cNvPr id="1" name=""/>
+                    <pic:cNvPicPr/>
+                  </pic:nvPicPr>
+                  <pic:blipFill>
+                    <a:blip r:embed="rId14"/>
+                    <a:stretch>
+                      <a:fillRect/>
+                    </a:stretch>
+                  </pic:blipFill>
+                  <pic:spPr>
+                    <a:xfrm>
+                      <a:off x="0" y="0"/>
+                      <a:ext cx="5733415" cy="3522345"/>
+                    </a:xfrm>
+                    <a:prstGeom prst="rect">
+                      <a:avLst/>
+                    </a:prstGeom>
+                  </pic:spPr>
+                </pic:pic>
+              </a:graphicData>
+            </a:graphic>
+          </wp:inline>
+        </w:drawing>
+      </w:r>
+    </w:p>
+    <w:p>
+      <w:pPr>
+        <w:pStyle w:val="Caption"/>
+        <w:rPr>
+          <w:lang w:val="pt-AO"/>
+        </w:rPr>
+      </w:pPr>
+      <w:r>
+        <w:t xml:space="preserve">Figura </w:t>
+      </w:r>
+      <w:r>
+        <w:fldChar w:fldCharType="begin"/>
+      </w:r>
+      <w:r>
+        <w:instrText xml:space="preserve"> SEQ Figura \* ARABIC </w:instrText>
+      </w:r>
+      <w:r>
+        <w:fldChar w:fldCharType="separate"/>
+      </w:r>
+      <w:r>
+        <w:rPr>
+          <w:noProof/>
+        </w:rPr>
+        <w:t>4</w:t>
+      </w:r>
+      <w:r>
+        <w:fldChar w:fldCharType="end"/>
+      </w:r>
+      <w:r>
+        <w:t xml:space="preserve"> - </w:t>
+      </w:r>
+      <w:r>
+        <w:t>Execução da versão serial do omp2.c (valores de referência)</w:t>
+      </w:r>
+    </w:p>
+    <w:p>
+      <w:pPr>
+        <w:pStyle w:val="ListParagraph"/>
+        <w:ind w:left="360"/>
+        <w:rPr>
+          <w:rFonts w:ascii="Courier New" w:hAnsi="Courier New" w:cs="Courier New"/>
+          <w:sz w:val="16"/>
+          <w:szCs w:val="16"/>
+          <w:lang w:val="pt-AO"/>
+        </w:rPr>
+      </w:pPr>
+      <w:r>
+        <w:rPr>
+          <w:rFonts w:ascii="Courier New" w:hAnsi="Courier New" w:cs="Courier New"/>
+          <w:sz w:val="16"/>
+          <w:szCs w:val="16"/>
+          <w:lang w:val="pt-AO"/>
+        </w:rPr>
+        <w:t>real    0m0.037s</w:t>
+      </w:r>
+    </w:p>
+    <w:p>
+      <w:pPr>
+        <w:pStyle w:val="ListParagraph"/>
+        <w:ind w:left="360"/>
+        <w:rPr>
+          <w:rFonts w:ascii="Courier New" w:hAnsi="Courier New" w:cs="Courier New"/>
+          <w:sz w:val="16"/>
+          <w:szCs w:val="16"/>
+          <w:lang w:val="pt-AO"/>
+        </w:rPr>
+      </w:pPr>
+      <w:r>
+        <w:rPr>
+          <w:rFonts w:ascii="Courier New" w:hAnsi="Courier New" w:cs="Courier New"/>
+          <w:sz w:val="16"/>
+          <w:szCs w:val="16"/>
+          <w:lang w:val="pt-AO"/>
+        </w:rPr>
+        <w:t>user    0m0.004s</w:t>
+      </w:r>
+    </w:p>
+    <w:p>
+      <w:pPr>
+        <w:pStyle w:val="ListParagraph"/>
+        <w:ind w:left="360"/>
+        <w:rPr>
+          <w:lang w:val="pt-AO"/>
+        </w:rPr>
+      </w:pPr>
+      <w:r>
+        <w:rPr>
+          <w:rFonts w:ascii="Courier New" w:hAnsi="Courier New" w:cs="Courier New"/>
+          <w:sz w:val="16"/>
+          <w:szCs w:val="16"/>
+          <w:lang w:val="pt-AO"/>
+        </w:rPr>
+        <w:t>sys     0m0.029s</w:t>
+      </w:r>
+    </w:p>
+    <w:p>
+      <w:pPr>
+        <w:pStyle w:val="ListParagraph"/>
+        <w:ind w:left="360"/>
+        <w:rPr>
+          <w:lang w:val="pt-AO"/>
+        </w:rPr>
+      </w:pPr>
+    </w:p>
+    <w:p>
+      <w:pPr>
+        <w:pStyle w:val="ListParagraph"/>
+        <w:ind w:left="360"/>
+      </w:pPr>
+      <w:r>
+        <w:t>O vector V é inicializado com valores de 0.0 a 999.0. Após 200 iterações do loop externo, os valores finais constituem a referência correcta para comparação com a versão paralela.</w:t>
+      </w:r>
+    </w:p>
+    <w:p>
+      <w:pPr>
+        <w:pStyle w:val="ListParagraph"/>
+        <w:ind w:left="360"/>
+      </w:pPr>
     </w:p>
     <w:p>
       <w:pPr>
@@ -433,7 +1509,310 @@
           <w:b/>
           <w:bCs/>
         </w:rPr>
-        <w:t xml:space="preserve">Porquê isso pode acontecer? </w:t>
+        <w:t>Porquê isso pode acontecer?</w:t>
+      </w:r>
+    </w:p>
+    <w:p>
+      <w:pPr>
+        <w:pStyle w:val="ListParagraph"/>
+        <w:ind w:left="360"/>
+      </w:pPr>
+      <w:r>
+        <w:t>R:</w:t>
+      </w:r>
+    </w:p>
+    <w:p>
+      <w:pPr>
+        <w:pStyle w:val="ListParagraph"/>
+        <w:ind w:left="360"/>
+      </w:pPr>
+      <w:r>
+        <w:t xml:space="preserve">Foi adicionada a directiva </w:t>
+      </w:r>
+      <w:r>
+        <w:rPr>
+          <w:rFonts w:ascii="Courier New" w:hAnsi="Courier New" w:cs="Courier New"/>
+        </w:rPr>
+        <w:t>#pragma omp parallel for</w:t>
+      </w:r>
+      <w:r>
+        <w:t xml:space="preserve"> ao loop interno, sem qualquer mecanismo de sincronização adicional:</w:t>
+      </w:r>
+    </w:p>
+    <w:p>
+      <w:pPr>
+        <w:pStyle w:val="ListParagraph"/>
+        <w:ind w:left="360"/>
+      </w:pPr>
+    </w:p>
+    <w:p>
+      <w:pPr>
+        <w:pBdr>
+          <w:left w:val="single" w:sz="4" w:space="10" w:color="4F81BD" w:themeColor="accent1"/>
+        </w:pBdr>
+        <w:spacing w:line="240" w:lineRule="auto"/>
+        <w:ind w:left="720"/>
+        <w:rPr>
+          <w:rFonts w:ascii="Courier New" w:eastAsia="Times New Roman" w:hAnsi="Courier New" w:cs="Courier New"/>
+          <w:sz w:val="16"/>
+          <w:szCs w:val="16"/>
+          <w:lang w:val="pt-BR"/>
+        </w:rPr>
+      </w:pPr>
+      <w:r>
+        <w:rPr>
+          <w:rFonts w:ascii="Courier New" w:eastAsia="Times New Roman" w:hAnsi="Courier New" w:cs="Courier New"/>
+          <w:sz w:val="16"/>
+          <w:szCs w:val="16"/>
+          <w:lang w:val="pt-BR"/>
+        </w:rPr>
+        <w:t>#pragma omp parallel for</w:t>
+      </w:r>
+    </w:p>
+    <w:p>
+      <w:pPr>
+        <w:pStyle w:val="ListParagraph"/>
+        <w:ind w:left="360"/>
+      </w:pPr>
+    </w:p>
+    <w:p>
+      <w:pPr>
+        <w:pStyle w:val="ListParagraph"/>
+        <w:ind w:left="360"/>
+      </w:pPr>
+      <w:r>
+        <w:t xml:space="preserve">O código foi compilado e executado </w:t>
+      </w:r>
+      <w:r>
+        <w:t>com pararelismo (incorretamente)</w:t>
+      </w:r>
+      <w:r>
+        <w:t>:</w:t>
+      </w:r>
+    </w:p>
+    <w:p>
+      <w:pPr>
+        <w:pStyle w:val="ListParagraph"/>
+        <w:ind w:left="360"/>
+        <w:rPr>
+          <w:lang w:val="pt-AO"/>
+        </w:rPr>
+      </w:pPr>
+    </w:p>
+    <w:p>
+      <w:pPr>
+        <w:pBdr>
+          <w:left w:val="single" w:sz="4" w:space="10" w:color="4F81BD" w:themeColor="accent1"/>
+        </w:pBdr>
+        <w:spacing w:line="240" w:lineRule="auto"/>
+        <w:ind w:left="720"/>
+        <w:rPr>
+          <w:rFonts w:ascii="Courier New" w:eastAsia="Times New Roman" w:hAnsi="Courier New" w:cs="Courier New"/>
+          <w:sz w:val="16"/>
+          <w:szCs w:val="16"/>
+          <w:lang w:val="pt-BR"/>
+        </w:rPr>
+      </w:pPr>
+      <w:r>
+        <w:rPr>
+          <w:rFonts w:ascii="Courier New" w:eastAsia="Times New Roman" w:hAnsi="Courier New" w:cs="Courier New"/>
+          <w:sz w:val="16"/>
+          <w:szCs w:val="16"/>
+          <w:lang w:val="pt-BR"/>
+        </w:rPr>
+        <w:t>cc -fopenmp omp2.c -o omp2</w:t>
+      </w:r>
+    </w:p>
+    <w:p>
+      <w:pPr>
+        <w:pBdr>
+          <w:left w:val="single" w:sz="4" w:space="10" w:color="4F81BD" w:themeColor="accent1"/>
+        </w:pBdr>
+        <w:spacing w:line="240" w:lineRule="auto"/>
+        <w:ind w:left="720"/>
+        <w:rPr>
+          <w:rFonts w:ascii="Courier New" w:eastAsia="Times New Roman" w:hAnsi="Courier New" w:cs="Courier New"/>
+          <w:sz w:val="16"/>
+          <w:szCs w:val="16"/>
+          <w:lang w:val="pt-BR"/>
+        </w:rPr>
+      </w:pPr>
+      <w:r>
+        <w:rPr>
+          <w:rFonts w:ascii="Courier New" w:eastAsia="Times New Roman" w:hAnsi="Courier New" w:cs="Courier New"/>
+          <w:sz w:val="16"/>
+          <w:szCs w:val="16"/>
+          <w:lang w:val="pt-BR"/>
+        </w:rPr>
+        <w:t>export OMP_NUM_THREADS=2</w:t>
+      </w:r>
+    </w:p>
+    <w:p>
+      <w:pPr>
+        <w:pBdr>
+          <w:left w:val="single" w:sz="4" w:space="10" w:color="4F81BD" w:themeColor="accent1"/>
+        </w:pBdr>
+        <w:spacing w:line="240" w:lineRule="auto"/>
+        <w:ind w:left="720"/>
+        <w:rPr>
+          <w:rFonts w:ascii="Courier New" w:eastAsia="Times New Roman" w:hAnsi="Courier New" w:cs="Courier New"/>
+          <w:sz w:val="16"/>
+          <w:szCs w:val="16"/>
+          <w:lang w:val="pt-BR"/>
+        </w:rPr>
+      </w:pPr>
+      <w:r>
+        <w:rPr>
+          <w:rFonts w:ascii="Courier New" w:eastAsia="Times New Roman" w:hAnsi="Courier New" w:cs="Courier New"/>
+          <w:sz w:val="16"/>
+          <w:szCs w:val="16"/>
+          <w:lang w:val="pt-BR"/>
+        </w:rPr>
+        <w:t>./omp2</w:t>
+      </w:r>
+    </w:p>
+    <w:p>
+      <w:pPr>
+        <w:pStyle w:val="ListParagraph"/>
+        <w:keepNext/>
+        <w:ind w:left="360"/>
+      </w:pPr>
+      <w:r>
+        <w:drawing>
+          <wp:inline distT="0" distB="0" distL="0" distR="0" wp14:anchorId="6D438E37" wp14:editId="47472A29">
+            <wp:extent cx="5733415" cy="3522345"/>
+            <wp:effectExtent l="0" t="0" r="635" b="1905"/>
+            <wp:docPr id="11" name="Picture 11"/>
+            <wp:cNvGraphicFramePr>
+              <a:graphicFrameLocks xmlns:a="http://schemas.openxmlformats.org/drawingml/2006/main" noChangeAspect="1"/>
+            </wp:cNvGraphicFramePr>
+            <a:graphic xmlns:a="http://schemas.openxmlformats.org/drawingml/2006/main">
+              <a:graphicData uri="http://schemas.openxmlformats.org/drawingml/2006/picture">
+                <pic:pic xmlns:pic="http://schemas.openxmlformats.org/drawingml/2006/picture">
+                  <pic:nvPicPr>
+                    <pic:cNvPr id="1" name=""/>
+                    <pic:cNvPicPr/>
+                  </pic:nvPicPr>
+                  <pic:blipFill>
+                    <a:blip r:embed="rId15"/>
+                    <a:stretch>
+                      <a:fillRect/>
+                    </a:stretch>
+                  </pic:blipFill>
+                  <pic:spPr>
+                    <a:xfrm>
+                      <a:off x="0" y="0"/>
+                      <a:ext cx="5733415" cy="3522345"/>
+                    </a:xfrm>
+                    <a:prstGeom prst="rect">
+                      <a:avLst/>
+                    </a:prstGeom>
+                  </pic:spPr>
+                </pic:pic>
+              </a:graphicData>
+            </a:graphic>
+          </wp:inline>
+        </w:drawing>
+      </w:r>
+    </w:p>
+    <w:p>
+      <w:pPr>
+        <w:pStyle w:val="Caption"/>
+      </w:pPr>
+      <w:r>
+        <w:t xml:space="preserve">Figura </w:t>
+      </w:r>
+      <w:r>
+        <w:fldChar w:fldCharType="begin"/>
+      </w:r>
+      <w:r>
+        <w:instrText xml:space="preserve"> SEQ Figura \* ARABIC </w:instrText>
+      </w:r>
+      <w:r>
+        <w:fldChar w:fldCharType="separate"/>
+      </w:r>
+      <w:r>
+        <w:rPr>
+          <w:noProof/>
+        </w:rPr>
+        <w:t>5</w:t>
+      </w:r>
+      <w:r>
+        <w:fldChar w:fldCharType="end"/>
+      </w:r>
+      <w:r>
+        <w:t xml:space="preserve"> – Execução da v</w:t>
+      </w:r>
+      <w:r>
+        <w:t xml:space="preserve">ersão paralela incorrecta do omp2.c e </w:t>
+      </w:r>
+      <w:r>
+        <w:t>divergência</w:t>
+      </w:r>
+      <w:r>
+        <w:t xml:space="preserve"> face à versão serial</w:t>
+      </w:r>
+    </w:p>
+    <w:p>
+      <w:pPr>
+        <w:pStyle w:val="ListParagraph"/>
+        <w:ind w:left="360"/>
+      </w:pPr>
+    </w:p>
+    <w:p>
+      <w:pPr>
+        <w:pStyle w:val="ListParagraph"/>
+        <w:ind w:left="360"/>
+      </w:pPr>
+      <w:r>
+        <w:t xml:space="preserve">Esta versão produz resultados incorrectos porque existe uma condição de corrida (race condition): a thread que processa a iteração </w:t>
+      </w:r>
+      <w:r>
+        <w:rPr>
+          <w:rFonts w:ascii="Courier New" w:hAnsi="Courier New" w:cs="Courier New"/>
+        </w:rPr>
+        <w:t>i</w:t>
+      </w:r>
+      <w:r>
+        <w:t xml:space="preserve"> pode ler </w:t>
+      </w:r>
+      <w:r>
+        <w:rPr>
+          <w:rFonts w:ascii="Courier New" w:hAnsi="Courier New" w:cs="Courier New"/>
+        </w:rPr>
+        <w:t>V[i+1]</w:t>
+      </w:r>
+      <w:r>
+        <w:t xml:space="preserve"> antes de a thread responsável pela iteração </w:t>
+      </w:r>
+      <w:r>
+        <w:rPr>
+          <w:rFonts w:ascii="Courier New" w:hAnsi="Courier New" w:cs="Courier New"/>
+        </w:rPr>
+        <w:t>i+1</w:t>
+      </w:r>
+      <w:r>
+        <w:t xml:space="preserve"> ter actualizado esse valor — ou vice-versa. A ordem de execução das threads não é garantida, pelo que o resultado depende do escalonamento e é não-determinístico.</w:t>
+      </w:r>
+    </w:p>
+    <w:p>
+      <w:pPr>
+        <w:pStyle w:val="ListParagraph"/>
+        <w:ind w:left="360"/>
+      </w:pPr>
+    </w:p>
+    <w:p>
+      <w:pPr>
+        <w:pStyle w:val="ListParagraph"/>
+        <w:ind w:left="360"/>
+      </w:pPr>
+    </w:p>
+    <w:p>
+      <w:pPr>
+        <w:jc w:val="left"/>
+      </w:pPr>
+      <w:r>
+        <w:br w:type="page"/>
       </w:r>
     </w:p>
     <w:p>
@@ -478,6 +1857,510 @@
     <w:p>
       <w:pPr>
         <w:pStyle w:val="ListParagraph"/>
+        <w:ind w:left="360"/>
+      </w:pPr>
+      <w:r>
+        <w:t>R:</w:t>
+      </w:r>
+    </w:p>
+    <w:p>
+      <w:pPr>
+        <w:pStyle w:val="ListParagraph"/>
+        <w:ind w:left="360"/>
+      </w:pPr>
+      <w:r>
+        <w:t xml:space="preserve">A correcção consiste em copiar o vector </w:t>
+      </w:r>
+      <w:r>
+        <w:rPr>
+          <w:rFonts w:ascii="Courier New" w:hAnsi="Courier New" w:cs="Courier New"/>
+        </w:rPr>
+        <w:t>V</w:t>
+      </w:r>
+      <w:r>
+        <w:t xml:space="preserve"> no início de cada iteração do loop externo e usar os valores copiados (</w:t>
+      </w:r>
+      <w:r>
+        <w:rPr>
+          <w:rFonts w:ascii="Courier New" w:hAnsi="Courier New" w:cs="Courier New"/>
+        </w:rPr>
+        <w:t>Vcopy</w:t>
+      </w:r>
+      <w:r>
+        <w:t xml:space="preserve">) como argumentos da função f, enquanto os resultados são escritos em </w:t>
+      </w:r>
+      <w:r>
+        <w:rPr>
+          <w:rFonts w:ascii="Courier New" w:hAnsi="Courier New" w:cs="Courier New"/>
+        </w:rPr>
+        <w:t>V</w:t>
+      </w:r>
+      <w:r>
+        <w:t xml:space="preserve">. Desta forma, a leitura de </w:t>
+      </w:r>
+      <w:r>
+        <w:rPr>
+          <w:rFonts w:ascii="Courier New" w:hAnsi="Courier New" w:cs="Courier New"/>
+        </w:rPr>
+        <w:t>V[i+1]</w:t>
+      </w:r>
+      <w:r>
+        <w:t xml:space="preserve"> é sempre feita a partir da cópia, que permanece inalterada durante toda a iteração paralela do loop interno.</w:t>
+      </w:r>
+    </w:p>
+    <w:p>
+      <w:pPr>
+        <w:pStyle w:val="ListParagraph"/>
+        <w:ind w:left="360"/>
+      </w:pPr>
+    </w:p>
+    <w:p>
+      <w:pPr>
+        <w:pStyle w:val="ListParagraph"/>
+        <w:keepNext/>
+        <w:ind w:left="360"/>
+      </w:pPr>
+      <w:r>
+        <w:drawing>
+          <wp:inline distT="0" distB="0" distL="0" distR="0" wp14:anchorId="56A56200" wp14:editId="1623881B">
+            <wp:extent cx="5733415" cy="579120"/>
+            <wp:effectExtent l="0" t="0" r="635" b="0"/>
+            <wp:docPr id="15" name="Picture 15"/>
+            <wp:cNvGraphicFramePr>
+              <a:graphicFrameLocks xmlns:a="http://schemas.openxmlformats.org/drawingml/2006/main" noChangeAspect="1"/>
+            </wp:cNvGraphicFramePr>
+            <a:graphic xmlns:a="http://schemas.openxmlformats.org/drawingml/2006/main">
+              <a:graphicData uri="http://schemas.openxmlformats.org/drawingml/2006/picture">
+                <pic:pic xmlns:pic="http://schemas.openxmlformats.org/drawingml/2006/picture">
+                  <pic:nvPicPr>
+                    <pic:cNvPr id="1" name=""/>
+                    <pic:cNvPicPr/>
+                  </pic:nvPicPr>
+                  <pic:blipFill>
+                    <a:blip r:embed="rId16"/>
+                    <a:stretch>
+                      <a:fillRect/>
+                    </a:stretch>
+                  </pic:blipFill>
+                  <pic:spPr>
+                    <a:xfrm>
+                      <a:off x="0" y="0"/>
+                      <a:ext cx="5733415" cy="579120"/>
+                    </a:xfrm>
+                    <a:prstGeom prst="rect">
+                      <a:avLst/>
+                    </a:prstGeom>
+                  </pic:spPr>
+                </pic:pic>
+              </a:graphicData>
+            </a:graphic>
+          </wp:inline>
+        </w:drawing>
+      </w:r>
+      <w:r>
+        <w:drawing>
+          <wp:inline distT="0" distB="0" distL="0" distR="0" wp14:anchorId="0B30DAA4" wp14:editId="5F2D1C7D">
+            <wp:extent cx="5733415" cy="2254250"/>
+            <wp:effectExtent l="0" t="0" r="635" b="0"/>
+            <wp:docPr id="16" name="Picture 16"/>
+            <wp:cNvGraphicFramePr>
+              <a:graphicFrameLocks xmlns:a="http://schemas.openxmlformats.org/drawingml/2006/main" noChangeAspect="1"/>
+            </wp:cNvGraphicFramePr>
+            <a:graphic xmlns:a="http://schemas.openxmlformats.org/drawingml/2006/main">
+              <a:graphicData uri="http://schemas.openxmlformats.org/drawingml/2006/picture">
+                <pic:pic xmlns:pic="http://schemas.openxmlformats.org/drawingml/2006/picture">
+                  <pic:nvPicPr>
+                    <pic:cNvPr id="1" name=""/>
+                    <pic:cNvPicPr/>
+                  </pic:nvPicPr>
+                  <pic:blipFill>
+                    <a:blip r:embed="rId17"/>
+                    <a:stretch>
+                      <a:fillRect/>
+                    </a:stretch>
+                  </pic:blipFill>
+                  <pic:spPr>
+                    <a:xfrm>
+                      <a:off x="0" y="0"/>
+                      <a:ext cx="5733415" cy="2254250"/>
+                    </a:xfrm>
+                    <a:prstGeom prst="rect">
+                      <a:avLst/>
+                    </a:prstGeom>
+                  </pic:spPr>
+                </pic:pic>
+              </a:graphicData>
+            </a:graphic>
+          </wp:inline>
+        </w:drawing>
+      </w:r>
+    </w:p>
+    <w:p>
+      <w:pPr>
+        <w:pStyle w:val="Caption"/>
+      </w:pPr>
+      <w:r>
+        <w:t xml:space="preserve">Figura </w:t>
+      </w:r>
+      <w:r>
+        <w:fldChar w:fldCharType="begin"/>
+      </w:r>
+      <w:r>
+        <w:instrText xml:space="preserve"> SEQ Figura \* ARABIC </w:instrText>
+      </w:r>
+      <w:r>
+        <w:fldChar w:fldCharType="separate"/>
+      </w:r>
+      <w:r>
+        <w:rPr>
+          <w:noProof/>
+        </w:rPr>
+        <w:t>6</w:t>
+      </w:r>
+      <w:r>
+        <w:fldChar w:fldCharType="end"/>
+      </w:r>
+      <w:r>
+        <w:t xml:space="preserve"> - </w:t>
+      </w:r>
+      <w:bookmarkStart w:id="2" w:name="_Hlk226237866"/>
+      <w:r>
+        <w:t>Versão paralela correcta com cópia do vector</w:t>
+      </w:r>
+      <w:bookmarkEnd w:id="2"/>
+    </w:p>
+    <w:p>
+      <w:pPr>
+        <w:pStyle w:val="ListParagraph"/>
+        <w:ind w:left="360"/>
+        <w:rPr>
+          <w:lang w:val="pt-AO"/>
+        </w:rPr>
+      </w:pPr>
+      <w:r>
+        <w:t>O código foi compilado e executado com os seguintes comandos:</w:t>
+      </w:r>
+    </w:p>
+    <w:p>
+      <w:pPr>
+        <w:pStyle w:val="ListParagraph"/>
+        <w:ind w:left="360"/>
+        <w:rPr>
+          <w:lang w:val="pt-AO"/>
+        </w:rPr>
+      </w:pPr>
+    </w:p>
+    <w:p>
+      <w:pPr>
+        <w:pBdr>
+          <w:left w:val="single" w:sz="4" w:space="10" w:color="4F81BD" w:themeColor="accent1"/>
+        </w:pBdr>
+        <w:spacing w:line="240" w:lineRule="auto"/>
+        <w:ind w:left="720"/>
+        <w:rPr>
+          <w:rFonts w:ascii="Courier New" w:eastAsia="Times New Roman" w:hAnsi="Courier New" w:cs="Courier New"/>
+          <w:sz w:val="16"/>
+          <w:szCs w:val="16"/>
+          <w:lang w:val="pt-AO"/>
+        </w:rPr>
+      </w:pPr>
+      <w:r>
+        <w:rPr>
+          <w:rFonts w:ascii="Courier New" w:eastAsia="Times New Roman" w:hAnsi="Courier New" w:cs="Courier New"/>
+          <w:sz w:val="16"/>
+          <w:szCs w:val="16"/>
+          <w:lang w:val="pt-AO"/>
+        </w:rPr>
+        <w:t>cc</w:t>
+      </w:r>
+      <w:r>
+        <w:rPr>
+          <w:rFonts w:ascii="Courier New" w:eastAsia="Times New Roman" w:hAnsi="Courier New" w:cs="Courier New"/>
+          <w:sz w:val="16"/>
+          <w:szCs w:val="16"/>
+          <w:lang w:val="pt-AO"/>
+        </w:rPr>
+        <w:t xml:space="preserve"> </w:t>
+      </w:r>
+      <w:r>
+        <w:rPr>
+          <w:rFonts w:ascii="Courier New" w:eastAsia="Times New Roman" w:hAnsi="Courier New" w:cs="Courier New"/>
+          <w:sz w:val="16"/>
+          <w:szCs w:val="16"/>
+          <w:lang w:val="pt-AO"/>
+        </w:rPr>
+        <w:t>omp</w:t>
+      </w:r>
+      <w:r>
+        <w:rPr>
+          <w:rFonts w:ascii="Courier New" w:eastAsia="Times New Roman" w:hAnsi="Courier New" w:cs="Courier New"/>
+          <w:sz w:val="16"/>
+          <w:szCs w:val="16"/>
+          <w:lang w:val="pt-AO"/>
+        </w:rPr>
+        <w:t>2</w:t>
+      </w:r>
+      <w:r>
+        <w:rPr>
+          <w:rFonts w:ascii="Courier New" w:eastAsia="Times New Roman" w:hAnsi="Courier New" w:cs="Courier New"/>
+          <w:sz w:val="16"/>
+          <w:szCs w:val="16"/>
+          <w:lang w:val="pt-AO"/>
+        </w:rPr>
+        <w:t>.c -o omp</w:t>
+      </w:r>
+      <w:r>
+        <w:rPr>
+          <w:rFonts w:ascii="Courier New" w:eastAsia="Times New Roman" w:hAnsi="Courier New" w:cs="Courier New"/>
+          <w:sz w:val="16"/>
+          <w:szCs w:val="16"/>
+          <w:lang w:val="pt-AO"/>
+        </w:rPr>
+        <w:t xml:space="preserve">2 </w:t>
+      </w:r>
+    </w:p>
+    <w:p>
+      <w:pPr>
+        <w:pBdr>
+          <w:left w:val="single" w:sz="4" w:space="10" w:color="4F81BD" w:themeColor="accent1"/>
+        </w:pBdr>
+        <w:spacing w:line="240" w:lineRule="auto"/>
+        <w:ind w:left="720"/>
+        <w:rPr>
+          <w:rFonts w:ascii="Courier New" w:eastAsia="Times New Roman" w:hAnsi="Courier New" w:cs="Courier New"/>
+          <w:sz w:val="16"/>
+          <w:szCs w:val="16"/>
+          <w:lang w:val="pt-AO"/>
+        </w:rPr>
+      </w:pPr>
+      <w:r>
+        <w:rPr>
+          <w:rFonts w:ascii="Courier New" w:eastAsia="Times New Roman" w:hAnsi="Courier New" w:cs="Courier New"/>
+          <w:sz w:val="16"/>
+          <w:szCs w:val="16"/>
+          <w:lang w:val="pt-AO"/>
+        </w:rPr>
+        <w:t>export OMP_NUM_THREADS=2</w:t>
+      </w:r>
+    </w:p>
+    <w:p>
+      <w:pPr>
+        <w:pBdr>
+          <w:left w:val="single" w:sz="4" w:space="10" w:color="4F81BD" w:themeColor="accent1"/>
+        </w:pBdr>
+        <w:spacing w:line="240" w:lineRule="auto"/>
+        <w:ind w:left="720"/>
+        <w:rPr>
+          <w:rFonts w:ascii="Courier New" w:eastAsia="Times New Roman" w:hAnsi="Courier New" w:cs="Courier New"/>
+          <w:sz w:val="16"/>
+          <w:szCs w:val="16"/>
+          <w:lang w:val="pt-BR"/>
+        </w:rPr>
+      </w:pPr>
+      <w:r>
+        <w:rPr>
+          <w:rFonts w:ascii="Courier New" w:eastAsia="Times New Roman" w:hAnsi="Courier New" w:cs="Courier New"/>
+          <w:sz w:val="16"/>
+          <w:szCs w:val="16"/>
+          <w:lang w:val="pt-BR"/>
+        </w:rPr>
+        <w:t>./omp2</w:t>
+      </w:r>
+    </w:p>
+    <w:p>
+      <w:pPr>
+        <w:pStyle w:val="ListParagraph"/>
+        <w:ind w:left="360"/>
+      </w:pPr>
+    </w:p>
+    <w:p>
+      <w:pPr>
+        <w:pStyle w:val="ListParagraph"/>
+        <w:keepNext/>
+        <w:ind w:left="360"/>
+      </w:pPr>
+      <w:r>
+        <w:drawing>
+          <wp:inline distT="0" distB="0" distL="0" distR="0" wp14:anchorId="0FD1A26A" wp14:editId="52970773">
+            <wp:extent cx="5733415" cy="3522345"/>
+            <wp:effectExtent l="0" t="0" r="635" b="1905"/>
+            <wp:docPr id="13" name="Picture 13"/>
+            <wp:cNvGraphicFramePr>
+              <a:graphicFrameLocks xmlns:a="http://schemas.openxmlformats.org/drawingml/2006/main" noChangeAspect="1"/>
+            </wp:cNvGraphicFramePr>
+            <a:graphic xmlns:a="http://schemas.openxmlformats.org/drawingml/2006/main">
+              <a:graphicData uri="http://schemas.openxmlformats.org/drawingml/2006/picture">
+                <pic:pic xmlns:pic="http://schemas.openxmlformats.org/drawingml/2006/picture">
+                  <pic:nvPicPr>
+                    <pic:cNvPr id="1" name=""/>
+                    <pic:cNvPicPr/>
+                  </pic:nvPicPr>
+                  <pic:blipFill>
+                    <a:blip r:embed="rId18"/>
+                    <a:stretch>
+                      <a:fillRect/>
+                    </a:stretch>
+                  </pic:blipFill>
+                  <pic:spPr>
+                    <a:xfrm>
+                      <a:off x="0" y="0"/>
+                      <a:ext cx="5733415" cy="3522345"/>
+                    </a:xfrm>
+                    <a:prstGeom prst="rect">
+                      <a:avLst/>
+                    </a:prstGeom>
+                  </pic:spPr>
+                </pic:pic>
+              </a:graphicData>
+            </a:graphic>
+          </wp:inline>
+        </w:drawing>
+      </w:r>
+    </w:p>
+    <w:p>
+      <w:pPr>
+        <w:pStyle w:val="Caption"/>
+      </w:pPr>
+      <w:r>
+        <w:t xml:space="preserve">Figura </w:t>
+      </w:r>
+      <w:r>
+        <w:fldChar w:fldCharType="begin"/>
+      </w:r>
+      <w:r>
+        <w:instrText xml:space="preserve"> SEQ Figura \* ARABIC </w:instrText>
+      </w:r>
+      <w:r>
+        <w:fldChar w:fldCharType="separate"/>
+      </w:r>
+      <w:r>
+        <w:rPr>
+          <w:noProof/>
+        </w:rPr>
+        <w:t>7</w:t>
+      </w:r>
+      <w:r>
+        <w:fldChar w:fldCharType="end"/>
+      </w:r>
+      <w:r>
+        <w:t xml:space="preserve"> – Execução </w:t>
+      </w:r>
+      <w:r>
+        <w:t xml:space="preserve">Versão paralela correcta </w:t>
+      </w:r>
+      <w:r>
+        <w:t xml:space="preserve">e </w:t>
+      </w:r>
+      <w:r>
+        <w:t xml:space="preserve">confirmação da igualdade </w:t>
+      </w:r>
+      <w:r>
+        <w:t>de</w:t>
+      </w:r>
+      <w:r>
+        <w:t xml:space="preserve"> resultados</w:t>
+      </w:r>
+    </w:p>
+    <w:p/>
+    <w:p>
+      <w:pPr>
+        <w:pStyle w:val="ListParagraph"/>
+        <w:ind w:left="360"/>
+      </w:pPr>
+      <w:r>
+        <w:t>Nesta versão, o resultado da execução paralela é idêntico ao da versão serial. A cópia garante que todas as threads lêem os valores de V do início da iteração, eliminando a condição de corrida.</w:t>
+      </w:r>
+    </w:p>
+    <w:p>
+      <w:pPr>
+        <w:pStyle w:val="ListParagraph"/>
+        <w:ind w:left="360"/>
+      </w:pPr>
+    </w:p>
+    <w:p>
+      <w:pPr>
+        <w:pStyle w:val="ListParagraph"/>
+        <w:ind w:left="360"/>
+        <w:rPr>
+          <w:rFonts w:ascii="Courier New" w:hAnsi="Courier New" w:cs="Courier New"/>
+          <w:sz w:val="16"/>
+          <w:szCs w:val="16"/>
+          <w:lang w:val="en-US"/>
+        </w:rPr>
+      </w:pPr>
+      <w:r>
+        <w:rPr>
+          <w:rFonts w:ascii="Courier New" w:hAnsi="Courier New" w:cs="Courier New"/>
+          <w:sz w:val="16"/>
+          <w:szCs w:val="16"/>
+          <w:lang w:val="en-US"/>
+        </w:rPr>
+        <w:t>real    0m0.031s</w:t>
+      </w:r>
+    </w:p>
+    <w:p>
+      <w:pPr>
+        <w:pStyle w:val="ListParagraph"/>
+        <w:ind w:left="360"/>
+        <w:rPr>
+          <w:rFonts w:ascii="Courier New" w:hAnsi="Courier New" w:cs="Courier New"/>
+          <w:sz w:val="16"/>
+          <w:szCs w:val="16"/>
+          <w:lang w:val="en-US"/>
+        </w:rPr>
+      </w:pPr>
+      <w:r>
+        <w:rPr>
+          <w:rFonts w:ascii="Courier New" w:hAnsi="Courier New" w:cs="Courier New"/>
+          <w:sz w:val="16"/>
+          <w:szCs w:val="16"/>
+          <w:lang w:val="en-US"/>
+        </w:rPr>
+        <w:t>user    0m0.008s</w:t>
+      </w:r>
+    </w:p>
+    <w:p>
+      <w:pPr>
+        <w:pStyle w:val="ListParagraph"/>
+        <w:ind w:left="360"/>
+        <w:rPr>
+          <w:rFonts w:ascii="Courier New" w:hAnsi="Courier New" w:cs="Courier New"/>
+          <w:sz w:val="16"/>
+          <w:szCs w:val="16"/>
+          <w:lang w:val="en-US"/>
+        </w:rPr>
+      </w:pPr>
+      <w:r>
+        <w:rPr>
+          <w:rFonts w:ascii="Courier New" w:hAnsi="Courier New" w:cs="Courier New"/>
+          <w:sz w:val="16"/>
+          <w:szCs w:val="16"/>
+          <w:lang w:val="en-US"/>
+        </w:rPr>
+        <w:t>sys     0m0.022s</w:t>
+      </w:r>
+    </w:p>
+    <w:p>
+      <w:pPr>
+        <w:pStyle w:val="ListParagraph"/>
+        <w:ind w:left="360"/>
+        <w:rPr>
+          <w:lang w:val="en-US"/>
+        </w:rPr>
+      </w:pPr>
+    </w:p>
+    <w:p>
+      <w:pPr>
+        <w:pStyle w:val="ListParagraph"/>
+        <w:ind w:left="360"/>
+        <w:rPr>
+          <w:lang w:val="pt-AO"/>
+        </w:rPr>
+      </w:pPr>
+    </w:p>
+    <w:p>
+      <w:pPr>
+        <w:pStyle w:val="ListParagraph"/>
         <w:numPr>
           <w:ilvl w:val="0"/>
           <w:numId w:val="15"/>
@@ -489,6 +2372,588 @@
     </w:p>
     <w:p>
       <w:pPr>
+        <w:pStyle w:val="ListParagraph"/>
+        <w:ind w:left="360"/>
+      </w:pPr>
+      <w:r>
+        <w:t>R:</w:t>
+      </w:r>
+    </w:p>
+    <w:p>
+      <w:pPr>
+        <w:pStyle w:val="ListParagraph"/>
+        <w:ind w:left="360"/>
+      </w:pPr>
+      <w:r>
+        <w:t xml:space="preserve">Para evitar a cópia do vetor em todas as iterações, foi utilizada uma abordagem baseada em </w:t>
+      </w:r>
+      <w:r>
+        <w:rPr>
+          <w:b/>
+          <w:bCs/>
+        </w:rPr>
+        <w:t>duplo buffer</w:t>
+      </w:r>
+      <w:r>
+        <w:t xml:space="preserve">, recorrendo a dois vetores distintos para </w:t>
+      </w:r>
+      <w:r>
+        <w:rPr>
+          <w:b/>
+          <w:bCs/>
+        </w:rPr>
+        <w:t>leitura</w:t>
+      </w:r>
+      <w:r>
+        <w:t xml:space="preserve"> e </w:t>
+      </w:r>
+      <w:r>
+        <w:rPr>
+          <w:b/>
+          <w:bCs/>
+        </w:rPr>
+        <w:t>escrita</w:t>
+      </w:r>
+      <w:r>
+        <w:t>. Em cada iteração, os cálculos são efectuados a partir do vetor fonte (</w:t>
+      </w:r>
+      <w:r>
+        <w:rPr>
+          <w:rFonts w:ascii="Courier New" w:hAnsi="Courier New" w:cs="Courier New"/>
+        </w:rPr>
+        <w:t>src</w:t>
+      </w:r>
+      <w:r>
+        <w:t>) e armazenados no vetor destino (</w:t>
+      </w:r>
+      <w:r>
+        <w:rPr>
+          <w:rFonts w:ascii="Courier New" w:hAnsi="Courier New" w:cs="Courier New"/>
+        </w:rPr>
+        <w:t>dst</w:t>
+      </w:r>
+      <w:r>
+        <w:t>), eliminando dependências de dados entre threads. Após o processamento, os ponteiros dos vetores são trocados, evitando operações de cópia e reduzindo o custo computacional. Adicionalmente, o último elemento do vetor é tratado separadamente para garantir a consistência dos dados.</w:t>
+      </w:r>
+    </w:p>
+    <w:p>
+      <w:pPr>
+        <w:pStyle w:val="ListParagraph"/>
+        <w:ind w:left="360"/>
+      </w:pPr>
+    </w:p>
+    <w:p>
+      <w:pPr>
+        <w:pStyle w:val="ListParagraph"/>
+        <w:ind w:left="360"/>
+      </w:pPr>
+    </w:p>
+    <w:p>
+      <w:pPr>
+        <w:pStyle w:val="ListParagraph"/>
+        <w:ind w:left="360"/>
+      </w:pPr>
+      <w:r>
+        <w:drawing>
+          <wp:inline distT="0" distB="0" distL="0" distR="0" wp14:anchorId="04B83C8A" wp14:editId="35D56ABC">
+            <wp:extent cx="5733415" cy="716915"/>
+            <wp:effectExtent l="0" t="0" r="635" b="6985"/>
+            <wp:docPr id="17" name="Picture 17"/>
+            <wp:cNvGraphicFramePr>
+              <a:graphicFrameLocks xmlns:a="http://schemas.openxmlformats.org/drawingml/2006/main" noChangeAspect="1"/>
+            </wp:cNvGraphicFramePr>
+            <a:graphic xmlns:a="http://schemas.openxmlformats.org/drawingml/2006/main">
+              <a:graphicData uri="http://schemas.openxmlformats.org/drawingml/2006/picture">
+                <pic:pic xmlns:pic="http://schemas.openxmlformats.org/drawingml/2006/picture">
+                  <pic:nvPicPr>
+                    <pic:cNvPr id="1" name=""/>
+                    <pic:cNvPicPr/>
+                  </pic:nvPicPr>
+                  <pic:blipFill>
+                    <a:blip r:embed="rId19"/>
+                    <a:stretch>
+                      <a:fillRect/>
+                    </a:stretch>
+                  </pic:blipFill>
+                  <pic:spPr>
+                    <a:xfrm>
+                      <a:off x="0" y="0"/>
+                      <a:ext cx="5733415" cy="716915"/>
+                    </a:xfrm>
+                    <a:prstGeom prst="rect">
+                      <a:avLst/>
+                    </a:prstGeom>
+                  </pic:spPr>
+                </pic:pic>
+              </a:graphicData>
+            </a:graphic>
+          </wp:inline>
+        </w:drawing>
+      </w:r>
+    </w:p>
+    <w:p>
+      <w:pPr>
+        <w:pStyle w:val="ListParagraph"/>
+        <w:ind w:left="360"/>
+      </w:pPr>
+    </w:p>
+    <w:p>
+      <w:pPr>
+        <w:pStyle w:val="ListParagraph"/>
+        <w:keepNext/>
+        <w:ind w:left="360"/>
+      </w:pPr>
+      <w:r>
+        <w:drawing>
+          <wp:inline distT="0" distB="0" distL="0" distR="0" wp14:anchorId="0875E749" wp14:editId="2E368C13">
+            <wp:extent cx="5572903" cy="2381582"/>
+            <wp:effectExtent l="0" t="0" r="0" b="0"/>
+            <wp:docPr id="18" name="Picture 18"/>
+            <wp:cNvGraphicFramePr>
+              <a:graphicFrameLocks xmlns:a="http://schemas.openxmlformats.org/drawingml/2006/main" noChangeAspect="1"/>
+            </wp:cNvGraphicFramePr>
+            <a:graphic xmlns:a="http://schemas.openxmlformats.org/drawingml/2006/main">
+              <a:graphicData uri="http://schemas.openxmlformats.org/drawingml/2006/picture">
+                <pic:pic xmlns:pic="http://schemas.openxmlformats.org/drawingml/2006/picture">
+                  <pic:nvPicPr>
+                    <pic:cNvPr id="1" name=""/>
+                    <pic:cNvPicPr/>
+                  </pic:nvPicPr>
+                  <pic:blipFill>
+                    <a:blip r:embed="rId20"/>
+                    <a:stretch>
+                      <a:fillRect/>
+                    </a:stretch>
+                  </pic:blipFill>
+                  <pic:spPr>
+                    <a:xfrm>
+                      <a:off x="0" y="0"/>
+                      <a:ext cx="5572903" cy="2381582"/>
+                    </a:xfrm>
+                    <a:prstGeom prst="rect">
+                      <a:avLst/>
+                    </a:prstGeom>
+                  </pic:spPr>
+                </pic:pic>
+              </a:graphicData>
+            </a:graphic>
+          </wp:inline>
+        </w:drawing>
+      </w:r>
+    </w:p>
+    <w:p>
+      <w:pPr>
+        <w:pStyle w:val="Caption"/>
+      </w:pPr>
+      <w:r>
+        <w:t xml:space="preserve">Figura </w:t>
+      </w:r>
+      <w:r>
+        <w:fldChar w:fldCharType="begin"/>
+      </w:r>
+      <w:r>
+        <w:instrText xml:space="preserve"> SEQ Figura \* ARABIC </w:instrText>
+      </w:r>
+      <w:r>
+        <w:fldChar w:fldCharType="separate"/>
+      </w:r>
+      <w:r>
+        <w:rPr>
+          <w:noProof/>
+        </w:rPr>
+        <w:t>8</w:t>
+      </w:r>
+      <w:r>
+        <w:fldChar w:fldCharType="end"/>
+      </w:r>
+      <w:r>
+        <w:t xml:space="preserve"> - </w:t>
+      </w:r>
+      <w:r>
+        <w:t>Versão paralela optimizada com double buffering (sem cópia explícita por iteração)</w:t>
+      </w:r>
+    </w:p>
+    <w:p>
+      <w:pPr>
+        <w:pStyle w:val="ListParagraph"/>
+        <w:ind w:left="360"/>
+      </w:pPr>
+    </w:p>
+    <w:p>
+      <w:pPr>
+        <w:pStyle w:val="ListParagraph"/>
+        <w:ind w:left="360"/>
+        <w:rPr>
+          <w:lang w:val="pt-AO"/>
+        </w:rPr>
+      </w:pPr>
+      <w:r>
+        <w:t>O código foi compilado</w:t>
+      </w:r>
+      <w:r>
+        <w:t xml:space="preserve"> e executado com os seguintes comandos</w:t>
+      </w:r>
+      <w:r>
+        <w:t>:</w:t>
+      </w:r>
+    </w:p>
+    <w:p>
+      <w:pPr>
+        <w:pStyle w:val="ListParagraph"/>
+        <w:ind w:left="360"/>
+        <w:rPr>
+          <w:lang w:val="pt-AO"/>
+        </w:rPr>
+      </w:pPr>
+    </w:p>
+    <w:p>
+      <w:pPr>
+        <w:pBdr>
+          <w:left w:val="single" w:sz="4" w:space="10" w:color="4F81BD" w:themeColor="accent1"/>
+        </w:pBdr>
+        <w:spacing w:line="240" w:lineRule="auto"/>
+        <w:ind w:left="720"/>
+        <w:rPr>
+          <w:rFonts w:ascii="Courier New" w:eastAsia="Times New Roman" w:hAnsi="Courier New" w:cs="Courier New"/>
+          <w:sz w:val="16"/>
+          <w:szCs w:val="16"/>
+          <w:lang w:val="pt-AO"/>
+        </w:rPr>
+      </w:pPr>
+      <w:r>
+        <w:rPr>
+          <w:rFonts w:ascii="Courier New" w:eastAsia="Times New Roman" w:hAnsi="Courier New" w:cs="Courier New"/>
+          <w:sz w:val="16"/>
+          <w:szCs w:val="16"/>
+          <w:lang w:val="pt-AO"/>
+        </w:rPr>
+        <w:t>cc</w:t>
+      </w:r>
+      <w:r>
+        <w:rPr>
+          <w:rFonts w:ascii="Courier New" w:eastAsia="Times New Roman" w:hAnsi="Courier New" w:cs="Courier New"/>
+          <w:sz w:val="16"/>
+          <w:szCs w:val="16"/>
+          <w:lang w:val="pt-AO"/>
+        </w:rPr>
+        <w:t xml:space="preserve"> </w:t>
+      </w:r>
+      <w:r>
+        <w:rPr>
+          <w:rFonts w:ascii="Courier New" w:eastAsia="Times New Roman" w:hAnsi="Courier New" w:cs="Courier New"/>
+          <w:sz w:val="16"/>
+          <w:szCs w:val="16"/>
+          <w:lang w:val="pt-AO"/>
+        </w:rPr>
+        <w:t>omp</w:t>
+      </w:r>
+      <w:r>
+        <w:rPr>
+          <w:rFonts w:ascii="Courier New" w:eastAsia="Times New Roman" w:hAnsi="Courier New" w:cs="Courier New"/>
+          <w:sz w:val="16"/>
+          <w:szCs w:val="16"/>
+          <w:lang w:val="pt-AO"/>
+        </w:rPr>
+        <w:t>2</w:t>
+      </w:r>
+      <w:r>
+        <w:rPr>
+          <w:rFonts w:ascii="Courier New" w:eastAsia="Times New Roman" w:hAnsi="Courier New" w:cs="Courier New"/>
+          <w:sz w:val="16"/>
+          <w:szCs w:val="16"/>
+          <w:lang w:val="pt-AO"/>
+        </w:rPr>
+        <w:t>.c -o omp</w:t>
+      </w:r>
+      <w:r>
+        <w:rPr>
+          <w:rFonts w:ascii="Courier New" w:eastAsia="Times New Roman" w:hAnsi="Courier New" w:cs="Courier New"/>
+          <w:sz w:val="16"/>
+          <w:szCs w:val="16"/>
+          <w:lang w:val="pt-AO"/>
+        </w:rPr>
+        <w:t xml:space="preserve">2 </w:t>
+      </w:r>
+    </w:p>
+    <w:p>
+      <w:pPr>
+        <w:pBdr>
+          <w:left w:val="single" w:sz="4" w:space="10" w:color="4F81BD" w:themeColor="accent1"/>
+        </w:pBdr>
+        <w:spacing w:line="240" w:lineRule="auto"/>
+        <w:ind w:left="720"/>
+        <w:rPr>
+          <w:rFonts w:ascii="Courier New" w:eastAsia="Times New Roman" w:hAnsi="Courier New" w:cs="Courier New"/>
+          <w:sz w:val="16"/>
+          <w:szCs w:val="16"/>
+          <w:lang w:val="pt-AO"/>
+        </w:rPr>
+      </w:pPr>
+      <w:r>
+        <w:rPr>
+          <w:rFonts w:ascii="Courier New" w:eastAsia="Times New Roman" w:hAnsi="Courier New" w:cs="Courier New"/>
+          <w:sz w:val="16"/>
+          <w:szCs w:val="16"/>
+          <w:lang w:val="pt-AO"/>
+        </w:rPr>
+        <w:t>export OMP_NUM_THREADS=2</w:t>
+      </w:r>
+    </w:p>
+    <w:p>
+      <w:pPr>
+        <w:pBdr>
+          <w:left w:val="single" w:sz="4" w:space="10" w:color="4F81BD" w:themeColor="accent1"/>
+        </w:pBdr>
+        <w:spacing w:line="240" w:lineRule="auto"/>
+        <w:ind w:left="720"/>
+        <w:rPr>
+          <w:rFonts w:ascii="Courier New" w:eastAsia="Times New Roman" w:hAnsi="Courier New" w:cs="Courier New"/>
+          <w:sz w:val="16"/>
+          <w:szCs w:val="16"/>
+          <w:lang w:val="pt-BR"/>
+        </w:rPr>
+      </w:pPr>
+      <w:r>
+        <w:rPr>
+          <w:rFonts w:ascii="Courier New" w:eastAsia="Times New Roman" w:hAnsi="Courier New" w:cs="Courier New"/>
+          <w:sz w:val="16"/>
+          <w:szCs w:val="16"/>
+          <w:lang w:val="pt-BR"/>
+        </w:rPr>
+        <w:t>./omp2</w:t>
+      </w:r>
+    </w:p>
+    <w:p>
+      <w:pPr>
+        <w:pStyle w:val="ListParagraph"/>
+        <w:ind w:left="360"/>
+        <w:rPr>
+          <w:lang w:val="pt-BR"/>
+        </w:rPr>
+      </w:pPr>
+    </w:p>
+    <w:p>
+      <w:pPr>
+        <w:pStyle w:val="ListParagraph"/>
+        <w:keepNext/>
+        <w:ind w:left="360"/>
+      </w:pPr>
+      <w:r>
+        <w:rPr>
+          <w:lang w:val="pt-BR"/>
+        </w:rPr>
+        <w:drawing>
+          <wp:inline distT="0" distB="0" distL="0" distR="0" wp14:anchorId="6057CF20" wp14:editId="7AE91A79">
+            <wp:extent cx="5733415" cy="3522345"/>
+            <wp:effectExtent l="0" t="0" r="635" b="1905"/>
+            <wp:docPr id="20" name="Picture 20"/>
+            <wp:cNvGraphicFramePr>
+              <a:graphicFrameLocks xmlns:a="http://schemas.openxmlformats.org/drawingml/2006/main" noChangeAspect="1"/>
+            </wp:cNvGraphicFramePr>
+            <a:graphic xmlns:a="http://schemas.openxmlformats.org/drawingml/2006/main">
+              <a:graphicData uri="http://schemas.openxmlformats.org/drawingml/2006/picture">
+                <pic:pic xmlns:pic="http://schemas.openxmlformats.org/drawingml/2006/picture">
+                  <pic:nvPicPr>
+                    <pic:cNvPr id="1" name=""/>
+                    <pic:cNvPicPr/>
+                  </pic:nvPicPr>
+                  <pic:blipFill>
+                    <a:blip r:embed="rId21"/>
+                    <a:stretch>
+                      <a:fillRect/>
+                    </a:stretch>
+                  </pic:blipFill>
+                  <pic:spPr>
+                    <a:xfrm>
+                      <a:off x="0" y="0"/>
+                      <a:ext cx="5733415" cy="3522345"/>
+                    </a:xfrm>
+                    <a:prstGeom prst="rect">
+                      <a:avLst/>
+                    </a:prstGeom>
+                  </pic:spPr>
+                </pic:pic>
+              </a:graphicData>
+            </a:graphic>
+          </wp:inline>
+        </w:drawing>
+      </w:r>
+    </w:p>
+    <w:p>
+      <w:pPr>
+        <w:pStyle w:val="Caption"/>
+      </w:pPr>
+      <w:r>
+        <w:t xml:space="preserve">Figura </w:t>
+      </w:r>
+      <w:r>
+        <w:fldChar w:fldCharType="begin"/>
+      </w:r>
+      <w:r>
+        <w:instrText xml:space="preserve"> SEQ Figura \* ARABIC </w:instrText>
+      </w:r>
+      <w:r>
+        <w:fldChar w:fldCharType="separate"/>
+      </w:r>
+      <w:r>
+        <w:rPr>
+          <w:noProof/>
+        </w:rPr>
+        <w:t>9</w:t>
+      </w:r>
+      <w:r>
+        <w:fldChar w:fldCharType="end"/>
+      </w:r>
+      <w:r>
+        <w:t xml:space="preserve"> </w:t>
+      </w:r>
+      <w:r>
+        <w:t>–</w:t>
+      </w:r>
+      <w:r>
+        <w:t xml:space="preserve"> </w:t>
+      </w:r>
+      <w:r>
+        <w:t>Execução da v</w:t>
+      </w:r>
+      <w:r>
+        <w:t>ersão paralela optimizada com double buffering</w:t>
+      </w:r>
+    </w:p>
+    <w:p>
+      <w:pPr>
+        <w:pStyle w:val="ListParagraph"/>
+        <w:ind w:left="360"/>
+        <w:rPr>
+          <w:lang w:val="pt-BR"/>
+        </w:rPr>
+      </w:pPr>
+    </w:p>
+    <w:p>
+      <w:pPr>
+        <w:pStyle w:val="ListParagraph"/>
+        <w:ind w:left="360"/>
+        <w:rPr>
+          <w:lang w:val="pt-BR"/>
+        </w:rPr>
+      </w:pPr>
+    </w:p>
+    <w:p>
+      <w:pPr>
+        <w:pStyle w:val="ListParagraph"/>
+        <w:ind w:left="360"/>
+        <w:rPr>
+          <w:rFonts w:ascii="Courier New" w:hAnsi="Courier New" w:cs="Courier New"/>
+          <w:sz w:val="16"/>
+          <w:szCs w:val="16"/>
+          <w:lang w:val="pt-BR"/>
+        </w:rPr>
+      </w:pPr>
+      <w:r>
+        <w:rPr>
+          <w:rFonts w:ascii="Courier New" w:hAnsi="Courier New" w:cs="Courier New"/>
+          <w:sz w:val="16"/>
+          <w:szCs w:val="16"/>
+          <w:lang w:val="pt-BR"/>
+        </w:rPr>
+        <w:t>real    0m0.021s</w:t>
+      </w:r>
+    </w:p>
+    <w:p>
+      <w:pPr>
+        <w:pStyle w:val="ListParagraph"/>
+        <w:ind w:left="360"/>
+        <w:rPr>
+          <w:rFonts w:ascii="Courier New" w:hAnsi="Courier New" w:cs="Courier New"/>
+          <w:sz w:val="16"/>
+          <w:szCs w:val="16"/>
+          <w:lang w:val="en-US"/>
+        </w:rPr>
+      </w:pPr>
+      <w:r>
+        <w:rPr>
+          <w:rFonts w:ascii="Courier New" w:hAnsi="Courier New" w:cs="Courier New"/>
+          <w:sz w:val="16"/>
+          <w:szCs w:val="16"/>
+          <w:lang w:val="en-US"/>
+        </w:rPr>
+        <w:t>user    0m0.014s</w:t>
+      </w:r>
+    </w:p>
+    <w:p>
+      <w:pPr>
+        <w:pStyle w:val="ListParagraph"/>
+        <w:ind w:left="360"/>
+        <w:rPr>
+          <w:rFonts w:ascii="Courier New" w:hAnsi="Courier New" w:cs="Courier New"/>
+          <w:sz w:val="16"/>
+          <w:szCs w:val="16"/>
+          <w:lang w:val="en-US"/>
+        </w:rPr>
+      </w:pPr>
+      <w:r>
+        <w:rPr>
+          <w:rFonts w:ascii="Courier New" w:hAnsi="Courier New" w:cs="Courier New"/>
+          <w:sz w:val="16"/>
+          <w:szCs w:val="16"/>
+          <w:lang w:val="en-US"/>
+        </w:rPr>
+        <w:t>sys     0m0.006s</w:t>
+      </w:r>
+    </w:p>
+    <w:p>
+      <w:pPr>
+        <w:pStyle w:val="ListParagraph"/>
+        <w:ind w:left="360"/>
+      </w:pPr>
+    </w:p>
+    <w:p>
+      <w:pPr>
+        <w:pStyle w:val="ListParagraph"/>
+        <w:ind w:left="360"/>
+      </w:pPr>
+      <w:r>
+        <w:t xml:space="preserve">Esta solução é mais eficiente do que a versão c) porque elimina a operação de </w:t>
+      </w:r>
+      <w:r>
+        <w:rPr>
+          <w:rFonts w:ascii="Courier New" w:hAnsi="Courier New" w:cs="Courier New"/>
+        </w:rPr>
+        <w:t>memcpy</w:t>
+      </w:r>
+      <w:r>
+        <w:t xml:space="preserve"> a cada iteração (</w:t>
+      </w:r>
+      <w:r>
+        <w:rPr>
+          <w:rFonts w:ascii="Courier New" w:hAnsi="Courier New" w:cs="Courier New"/>
+        </w:rPr>
+        <w:t>O(N)</w:t>
+      </w:r>
+      <w:r>
+        <w:t xml:space="preserve"> por iter), substituindo-a por uma simples troca de ponteiros (</w:t>
+      </w:r>
+      <w:r>
+        <w:rPr>
+          <w:rFonts w:ascii="Courier New" w:hAnsi="Courier New" w:cs="Courier New"/>
+        </w:rPr>
+        <w:t>O(1)</w:t>
+      </w:r>
+      <w:r>
+        <w:t>). O resultado final permanece correcto e idêntico à versão serial.</w:t>
+      </w:r>
+    </w:p>
+    <w:p>
+      <w:pPr>
+        <w:pStyle w:val="ListParagraph"/>
+        <w:ind w:left="360"/>
+        <w:rPr>
+          <w:lang w:val="pt-BR"/>
+        </w:rPr>
+      </w:pPr>
+    </w:p>
+    <w:p>
+      <w:pPr>
         <w:pStyle w:val="Heading1"/>
       </w:pPr>
       <w:bookmarkStart w:id="3" w:name="_82ktdkirx157" w:colFirst="0" w:colLast="0"/>
@@ -498,11 +2963,173 @@
       </w:r>
     </w:p>
     <w:p>
-      <w:pPr>
-        <w:rPr>
-          <w:lang w:val="pt-AO"/>
-        </w:rPr>
-      </w:pPr>
+      <w:r>
+        <w:t>Ao longo da realização desta aula de laboratório, foram identificados os seguintes desafios:</w:t>
+      </w:r>
+    </w:p>
+    <w:p/>
+    <w:p>
+      <w:pPr>
+        <w:rPr>
+          <w:lang w:val="pt-AO"/>
+        </w:rPr>
+      </w:pPr>
+      <w:r>
+        <w:t>Compilar o programa: ao compilar um</w:t>
+      </w:r>
+      <w:r>
+        <w:rPr>
+          <w:lang w:val="pt-AO"/>
+        </w:rPr>
+        <w:t xml:space="preserve"> programa que possui funções da biblioteca </w:t>
+      </w:r>
+      <w:r>
+        <w:rPr>
+          <w:rFonts w:ascii="Courier New" w:hAnsi="Courier New" w:cs="Courier New"/>
+          <w:lang w:val="pt-BR"/>
+        </w:rPr>
+        <w:t>&lt;omp.h&gt;</w:t>
+      </w:r>
+      <w:r>
+        <w:rPr>
+          <w:lang w:val="pt-AO"/>
+        </w:rPr>
+        <w:t xml:space="preserve"> sem a flag de compilação </w:t>
+      </w:r>
+      <w:r>
+        <w:rPr>
+          <w:rFonts w:ascii="Courier New" w:hAnsi="Courier New" w:cs="Courier New"/>
+          <w:lang w:val="pt-AO"/>
+        </w:rPr>
+        <w:t>-f</w:t>
+      </w:r>
+      <w:r>
+        <w:rPr>
+          <w:rFonts w:ascii="Courier New" w:hAnsi="Courier New" w:cs="Courier New"/>
+          <w:lang w:val="pt-AO"/>
+        </w:rPr>
+        <w:t>openmp</w:t>
+      </w:r>
+      <w:r>
+        <w:rPr>
+          <w:lang w:val="pt-AO"/>
+        </w:rPr>
+        <w:t xml:space="preserve"> geralmente dá o</w:t>
+      </w:r>
+      <w:r>
+        <w:rPr>
+          <w:lang w:val="pt-AO"/>
+        </w:rPr>
+        <w:t xml:space="preserve"> seguinte</w:t>
+      </w:r>
+      <w:r>
+        <w:rPr>
+          <w:lang w:val="pt-AO"/>
+        </w:rPr>
+        <w:t xml:space="preserve"> erro:</w:t>
+      </w:r>
+    </w:p>
+    <w:p>
+      <w:pPr>
+        <w:rPr>
+          <w:rFonts w:ascii="Courier New" w:hAnsi="Courier New" w:cs="Courier New"/>
+          <w:sz w:val="16"/>
+          <w:szCs w:val="16"/>
+          <w:lang w:val="pt-AO"/>
+        </w:rPr>
+      </w:pPr>
+    </w:p>
+    <w:p>
+      <w:pPr>
+        <w:rPr>
+          <w:rFonts w:ascii="Courier New" w:hAnsi="Courier New" w:cs="Courier New"/>
+          <w:sz w:val="16"/>
+          <w:szCs w:val="16"/>
+          <w:lang w:val="pt-AO"/>
+        </w:rPr>
+      </w:pPr>
+      <w:r>
+        <w:rPr>
+          <w:rFonts w:ascii="Courier New" w:hAnsi="Courier New" w:cs="Courier New"/>
+          <w:sz w:val="16"/>
+          <w:szCs w:val="16"/>
+          <w:lang w:val="pt-AO"/>
+        </w:rPr>
+        <w:t>/usr/bin/ld: /tmp/ccpwMbXP.o: in function `main':</w:t>
+      </w:r>
+    </w:p>
+    <w:p>
+      <w:pPr>
+        <w:rPr>
+          <w:rFonts w:ascii="Courier New" w:hAnsi="Courier New" w:cs="Courier New"/>
+          <w:sz w:val="16"/>
+          <w:szCs w:val="16"/>
+          <w:lang w:val="pt-AO"/>
+        </w:rPr>
+      </w:pPr>
+      <w:r>
+        <w:rPr>
+          <w:rFonts w:ascii="Courier New" w:hAnsi="Courier New" w:cs="Courier New"/>
+          <w:sz w:val="16"/>
+          <w:szCs w:val="16"/>
+          <w:lang w:val="pt-AO"/>
+        </w:rPr>
+        <w:t>omp1.c:(.text+0x14): undefined reference to `omp_get_thread_num'</w:t>
+      </w:r>
+    </w:p>
+    <w:p>
+      <w:pPr>
+        <w:rPr>
+          <w:rFonts w:ascii="Courier New" w:hAnsi="Courier New" w:cs="Courier New"/>
+          <w:sz w:val="16"/>
+          <w:szCs w:val="16"/>
+          <w:lang w:val="pt-AO"/>
+        </w:rPr>
+      </w:pPr>
+      <w:r>
+        <w:rPr>
+          <w:rFonts w:ascii="Courier New" w:hAnsi="Courier New" w:cs="Courier New"/>
+          <w:sz w:val="16"/>
+          <w:szCs w:val="16"/>
+          <w:lang w:val="pt-AO"/>
+        </w:rPr>
+        <w:t>collect2: error: ld returned 1 exit status</w:t>
+      </w:r>
+    </w:p>
+    <w:p>
+      <w:pPr>
+        <w:rPr>
+          <w:rFonts w:ascii="Courier New" w:hAnsi="Courier New" w:cs="Courier New"/>
+          <w:sz w:val="16"/>
+          <w:szCs w:val="16"/>
+          <w:lang w:val="pt-AO"/>
+        </w:rPr>
+      </w:pPr>
+    </w:p>
+    <w:p>
+      <w:r>
+        <w:t>Identificar a condição de corrida no Problema 2: foi necessário executar o programa várias vezes e comparar os resultados com a versão serial para confirmar a incorrecção da versão paralela simples.</w:t>
+      </w:r>
+    </w:p>
+    <w:p/>
+    <w:p>
+      <w:pPr>
+        <w:rPr>
+          <w:lang w:val="pt-AO"/>
+        </w:rPr>
+      </w:pPr>
+      <w:r>
+        <w:t>Apesar da paralelização implementada</w:t>
+      </w:r>
+      <w:r>
+        <w:t xml:space="preserve"> no problema 2</w:t>
+      </w:r>
+      <w:r>
+        <w:t>, não se observou um ganho significativo de desempenho para um número elevado de threads. Tal comportamento deve-se ao reduzido volume de trabalho por iteração e ao overhead associado à gestão de threads no OpenMP</w:t>
+      </w:r>
+      <w:r>
+        <w:t>.</w:t>
+      </w:r>
     </w:p>
     <w:p>
       <w:pPr>
@@ -514,7 +3141,97 @@
         <w:t xml:space="preserve">Referências Bibliográficas </w:t>
       </w:r>
     </w:p>
-    <w:p/>
+    <w:p>
+      <w:pPr>
+        <w:spacing w:after="120"/>
+      </w:pPr>
+      <w:r>
+        <w:rPr>
+          <w:lang w:val="en-US"/>
+        </w:rPr>
+        <w:t xml:space="preserve">OpenMP Architecture Review Board. </w:t>
+      </w:r>
+      <w:r>
+        <w:rPr>
+          <w:i/>
+          <w:iCs/>
+          <w:lang w:val="en-US"/>
+        </w:rPr>
+        <w:t>OpenMP Application Programming Interface, Version 4.5.</w:t>
+      </w:r>
+      <w:r>
+        <w:rPr>
+          <w:lang w:val="en-US"/>
+        </w:rPr>
+        <w:t xml:space="preserve"> </w:t>
+      </w:r>
+      <w:r>
+        <w:t xml:space="preserve">Novembro 2015. Disponível em: </w:t>
+      </w:r>
+      <w:hyperlink r:id="rId22" w:history="1">
+        <w:r>
+          <w:rPr>
+            <w:rStyle w:val="Hyperlink"/>
+          </w:rPr>
+          <w:t>https://www.openmp.org/wp-content/uploads/openmp-4.5.pdf</w:t>
+        </w:r>
+      </w:hyperlink>
+    </w:p>
+    <w:p>
+      <w:pPr>
+        <w:spacing w:after="120"/>
+        <w:rPr>
+          <w:lang w:val="en-US"/>
+        </w:rPr>
+      </w:pPr>
+      <w:r>
+        <w:t xml:space="preserve">Costa, J. </w:t>
+      </w:r>
+      <w:r>
+        <w:rPr>
+          <w:i/>
+          <w:iCs/>
+        </w:rPr>
+        <w:t>Computação Paralela e Distribuída – Aula de Laboratório Nº 2.</w:t>
+      </w:r>
+      <w:r>
+        <w:t xml:space="preserve"> </w:t>
+      </w:r>
+      <w:r>
+        <w:rPr>
+          <w:lang w:val="en-US"/>
+        </w:rPr>
+        <w:t>ISPTEC, 2021-22.</w:t>
+      </w:r>
+    </w:p>
+    <w:p>
+      <w:pPr>
+        <w:spacing w:after="200"/>
+        <w:rPr>
+          <w:lang w:val="en-US"/>
+        </w:rPr>
+      </w:pPr>
+      <w:r>
+        <w:rPr>
+          <w:lang w:val="en-US"/>
+        </w:rPr>
+        <w:t xml:space="preserve">Chapman, B., Jost, G., van der Pas, R. </w:t>
+      </w:r>
+      <w:r>
+        <w:rPr>
+          <w:i/>
+          <w:iCs/>
+          <w:lang w:val="en-US"/>
+        </w:rPr>
+        <w:t>Using OpenMP: Portable Shared Memory Parallel Programming.</w:t>
+      </w:r>
+      <w:r>
+        <w:rPr>
+          <w:lang w:val="en-US"/>
+        </w:rPr>
+        <w:t xml:space="preserve"> MIT Press, 2008.</w:t>
+      </w:r>
+    </w:p>
     <w:p>
       <w:pPr>
         <w:pStyle w:val="Heading1"/>
@@ -522,33 +3239,25 @@
           <w:lang w:val="en-US"/>
         </w:rPr>
       </w:pPr>
-      <w:proofErr w:type="spellStart"/>
       <w:r>
         <w:rPr>
           <w:lang w:val="en-US"/>
         </w:rPr>
-        <w:t>Repositório</w:t>
-      </w:r>
-      <w:proofErr w:type="spellEnd"/>
-      <w:r>
+        <w:t xml:space="preserve">Repositório GitHub </w:t>
+      </w:r>
+    </w:p>
+    <w:p>
+      <w:pPr>
         <w:rPr>
           <w:lang w:val="en-US"/>
         </w:rPr>
-        <w:t xml:space="preserve"> GitHub </w:t>
-      </w:r>
-    </w:p>
-    <w:p>
-      <w:pPr>
-        <w:rPr>
-          <w:lang w:val="en-US"/>
-        </w:rPr>
       </w:pPr>
     </w:p>
     <w:p>
       <w:r>
         <w:t xml:space="preserve">Repositório: </w:t>
       </w:r>
-      <w:hyperlink r:id="rId11" w:history="1">
+      <w:hyperlink r:id="rId23" w:history="1">
         <w:r>
           <w:rPr>
             <w:rStyle w:val="Hyperlink"/>
@@ -1349,7 +4058,7 @@
         <w:rFonts w:hint="default"/>
       </w:rPr>
     </w:lvl>
-    <w:lvl w:ilvl="1" w:tplc="0C000019" w:tentative="1">
+    <w:lvl w:ilvl="1" w:tplc="0C000019">
       <w:start w:val="1"/>
       <w:numFmt w:val="lowerLetter"/>
       <w:lvlText w:val="%2."/>
@@ -3000,7 +5709,7 @@
   <w:style w:type="paragraph" w:default="1" w:styleId="Normal">
     <w:name w:val="Normal"/>
     <w:qFormat/>
-    <w:rsid w:val="0051295D"/>
+    <w:rsid w:val="00F22F96"/>
     <w:pPr>
       <w:jc w:val="both"/>
     </w:pPr>
@@ -3368,14 +6077,14 @@
     <w:uiPriority w:val="35"/>
     <w:unhideWhenUsed/>
     <w:qFormat/>
-    <w:rsid w:val="00562C05"/>
+    <w:rsid w:val="005024EE"/>
     <w:pPr>
-      <w:spacing w:after="200" w:line="240" w:lineRule="auto"/>
+      <w:spacing w:before="120" w:after="200" w:line="360" w:lineRule="auto"/>
+      <w:jc w:val="center"/>
     </w:pPr>
     <w:rPr>
       <w:i/>
       <w:iCs/>
-      <w:color w:val="1F497D" w:themeColor="text2"/>
       <w:sz w:val="18"/>
       <w:szCs w:val="18"/>
     </w:rPr>

</xml_diff>